<commit_message>
Section 12 and 13
</commit_message>
<xml_diff>
--- a/Section 11/How would we debug the microservices.docx
+++ b/Section 11/How would we debug the microservices.docx
@@ -298,14 +298,12 @@
         </w:rPr>
         <w:t xml:space="preserve">, like making log if CPU usage is 80%, troubleshoot, Notifications, </w:t>
       </w:r>
-      <w:proofErr w:type="gramStart"/>
-      <w:r>
-        <w:rPr>
-          <w:lang w:val="en-GB"/>
-        </w:rPr>
-        <w:t>Identify</w:t>
-      </w:r>
-      <w:proofErr w:type="gramEnd"/>
+      <w:r>
+        <w:rPr>
+          <w:lang w:val="en-GB"/>
+        </w:rPr>
+        <w:t>identify</w:t>
+      </w:r>
       <w:r>
         <w:rPr>
           <w:lang w:val="en-GB"/>
@@ -408,21 +406,7 @@
         <w:rPr>
           <w:lang w:val="en-GB"/>
         </w:rPr>
-        <w:t xml:space="preserve"> It can be used with Loki and </w:t>
-      </w:r>
-      <w:proofErr w:type="spellStart"/>
-      <w:r>
-        <w:rPr>
-          <w:lang w:val="en-GB"/>
-        </w:rPr>
-        <w:t>Promtail</w:t>
-      </w:r>
-      <w:proofErr w:type="spellEnd"/>
-      <w:r>
-        <w:rPr>
-          <w:lang w:val="en-GB"/>
-        </w:rPr>
-        <w:t>.</w:t>
+        <w:t xml:space="preserve"> It can be used with Loki and Promtail.</w:t>
       </w:r>
       <w:r>
         <w:rPr>
@@ -516,7 +500,6 @@
         </w:rPr>
         <w:t> onwards, </w:t>
       </w:r>
-      <w:proofErr w:type="spellStart"/>
       <w:r>
         <w:rPr>
           <w:b/>
@@ -525,7 +508,6 @@
         </w:rPr>
         <w:t>Promtail</w:t>
       </w:r>
-      <w:proofErr w:type="spellEnd"/>
       <w:r>
         <w:rPr>
           <w:lang w:val="en-PK"/>
@@ -544,35 +526,7 @@
         <w:rPr>
           <w:lang w:val="en-PK"/>
         </w:rPr>
-        <w:t xml:space="preserve">. Even though I will discuss </w:t>
-      </w:r>
-      <w:proofErr w:type="spellStart"/>
-      <w:r>
-        <w:rPr>
-          <w:lang w:val="en-PK"/>
-        </w:rPr>
-        <w:t>Promtail</w:t>
-      </w:r>
-      <w:proofErr w:type="spellEnd"/>
-      <w:r>
-        <w:rPr>
-          <w:lang w:val="en-PK"/>
-        </w:rPr>
-        <w:t xml:space="preserve"> in the next few lectures, Alloy will function similarly. Since these are internal components of Grafana Loki, this change will not have a significant impact. We just need to use the config files related to Alloy in place of </w:t>
-      </w:r>
-      <w:proofErr w:type="spellStart"/>
-      <w:r>
-        <w:rPr>
-          <w:lang w:val="en-PK"/>
-        </w:rPr>
-        <w:t>Promtail</w:t>
-      </w:r>
-      <w:proofErr w:type="spellEnd"/>
-      <w:r>
-        <w:rPr>
-          <w:lang w:val="en-PK"/>
-        </w:rPr>
-        <w:t>.</w:t>
+        <w:t>. Even though I will discuss Promtail in the next few lectures, Alloy will function similarly. Since these are internal components of Grafana Loki, this change will not have a significant impact. We just need to use the config files related to Alloy in place of Promtail.</w:t>
       </w:r>
     </w:p>
     <w:p>
@@ -591,6 +545,13 @@
         </w:rPr>
         <w:t>All the Docker Compose files have been updated with Alloy-related changes inside the GitHub repo. You can find the documentation for Alloy along with Loki in the following link:</w:t>
       </w:r>
+    </w:p>
+    <w:p>
+      <w:pPr>
+        <w:rPr>
+          <w:lang w:val="en-PK"/>
+        </w:rPr>
+      </w:pPr>
     </w:p>
     <w:p>
       <w:pPr>
@@ -624,36 +585,2115 @@
         <w:rPr>
           <w:lang w:val="en-PK"/>
         </w:rPr>
-        <w:t xml:space="preserve">If for any reason your real projects use older versions of Grafana Loki, then you will need to use </w:t>
-      </w:r>
-      <w:proofErr w:type="spellStart"/>
-      <w:r>
-        <w:rPr>
-          <w:lang w:val="en-PK"/>
-        </w:rPr>
-        <w:t>Promtail</w:t>
-      </w:r>
-      <w:proofErr w:type="spellEnd"/>
-      <w:r>
-        <w:rPr>
-          <w:lang w:val="en-PK"/>
-        </w:rPr>
-        <w:t xml:space="preserve">. </w:t>
-      </w:r>
-      <w:proofErr w:type="spellStart"/>
-      <w:r>
-        <w:rPr>
-          <w:lang w:val="en-PK"/>
-        </w:rPr>
-        <w:t>Promtail</w:t>
-      </w:r>
-      <w:proofErr w:type="spellEnd"/>
-      <w:r>
-        <w:rPr>
-          <w:lang w:val="en-PK"/>
-        </w:rPr>
-        <w:t>-related changes are available in the older branches of the course GitHub repo.</w:t>
-      </w:r>
+        <w:t>If for any reason your real projects use older versions of Grafana Loki, then you will need to use Promtail. Promtail-related changes are available in the older branches of the course GitHub repo.</w:t>
+      </w:r>
+    </w:p>
+    <w:p>
+      <w:pPr>
+        <w:rPr>
+          <w:lang w:val="en-PK"/>
+        </w:rPr>
+      </w:pPr>
+    </w:p>
+    <w:p>
+      <w:pPr>
+        <w:rPr>
+          <w:lang w:val="en-PK"/>
+        </w:rPr>
+      </w:pPr>
+      <w:r>
+        <w:rPr>
+          <w:lang w:val="en-PK"/>
+        </w:rPr>
+        <w:t>Inside loki, minio is storage area.</w:t>
+      </w:r>
+    </w:p>
+    <w:p>
+      <w:pPr>
+        <w:rPr>
+          <w:lang w:val="en-PK"/>
+        </w:rPr>
+      </w:pPr>
+    </w:p>
+    <w:p>
+      <w:pPr>
+        <w:rPr>
+          <w:lang w:val="en-PK"/>
+        </w:rPr>
+      </w:pPr>
+      <w:r>
+        <w:rPr>
+          <w:lang w:val="en-PK"/>
+        </w:rPr>
+        <w:t>Localhost:3000 to access Grafana dashboard</w:t>
+      </w:r>
+      <w:r>
+        <w:rPr>
+          <w:lang w:val="en-PK"/>
+        </w:rPr>
+        <w:t>, .data storing logs but we can use AWS to store logs.</w:t>
+      </w:r>
+    </w:p>
+    <w:p>
+      <w:pPr>
+        <w:rPr>
+          <w:lang w:val="en-PK"/>
+        </w:rPr>
+      </w:pPr>
+      <w:r>
+        <w:rPr>
+          <w:lang w:val="en-PK"/>
+        </w:rPr>
+        <w:t>Actuator, Micrometer</w:t>
+      </w:r>
+      <w:r>
+        <w:rPr>
+          <w:lang w:val="en-PK"/>
+        </w:rPr>
+        <w:t xml:space="preserve"> for metrices</w:t>
+      </w:r>
+      <w:r>
+        <w:rPr>
+          <w:lang w:val="en-PK"/>
+        </w:rPr>
+        <w:t xml:space="preserve"> using micrometer.io</w:t>
+      </w:r>
+    </w:p>
+    <w:p>
+      <w:pPr>
+        <w:rPr>
+          <w:lang w:val="en-PK"/>
+        </w:rPr>
+      </w:pPr>
+    </w:p>
+    <w:p>
+      <w:pPr>
+        <w:rPr>
+          <w:lang w:val="en-PK"/>
+        </w:rPr>
+      </w:pPr>
+      <w:r>
+        <w:rPr>
+          <w:lang w:val="en-PK"/>
+        </w:rPr>
+        <w:t xml:space="preserve">Got it — let me explain </w:t>
+      </w:r>
+      <w:r>
+        <w:rPr>
+          <w:b/>
+          <w:bCs/>
+          <w:lang w:val="en-PK"/>
+        </w:rPr>
+        <w:t>SLF4J</w:t>
+      </w:r>
+      <w:r>
+        <w:rPr>
+          <w:lang w:val="en-PK"/>
+        </w:rPr>
+        <w:t xml:space="preserve"> in simple terms first!</w:t>
+      </w:r>
+    </w:p>
+    <w:p>
+      <w:pPr>
+        <w:rPr>
+          <w:b/>
+          <w:bCs/>
+          <w:lang w:val="en-PK"/>
+        </w:rPr>
+      </w:pPr>
+      <w:r>
+        <w:rPr>
+          <w:b/>
+          <w:bCs/>
+          <w:lang w:val="en-PK"/>
+        </w:rPr>
+        <w:t>What is SLF4J?</w:t>
+      </w:r>
+    </w:p>
+    <w:p>
+      <w:pPr>
+        <w:rPr>
+          <w:lang w:val="en-PK"/>
+        </w:rPr>
+      </w:pPr>
+      <w:r>
+        <w:rPr>
+          <w:b/>
+          <w:bCs/>
+          <w:lang w:val="en-PK"/>
+        </w:rPr>
+        <w:t>SLF4J</w:t>
+      </w:r>
+      <w:r>
+        <w:rPr>
+          <w:lang w:val="en-PK"/>
+        </w:rPr>
+        <w:t xml:space="preserve"> stands for </w:t>
+      </w:r>
+      <w:r>
+        <w:rPr>
+          <w:b/>
+          <w:bCs/>
+          <w:lang w:val="en-PK"/>
+        </w:rPr>
+        <w:t>Simple Logging Facade for Java</w:t>
+      </w:r>
+      <w:r>
+        <w:rPr>
+          <w:lang w:val="en-PK"/>
+        </w:rPr>
+        <w:t>.</w:t>
+      </w:r>
+    </w:p>
+    <w:p>
+      <w:pPr>
+        <w:rPr>
+          <w:lang w:val="en-PK"/>
+        </w:rPr>
+      </w:pPr>
+      <w:r>
+        <w:rPr>
+          <w:lang w:val="en-PK"/>
+        </w:rPr>
+        <w:t xml:space="preserve">It's not a logger by itself. Instead, it provides a </w:t>
+      </w:r>
+      <w:r>
+        <w:rPr>
+          <w:b/>
+          <w:bCs/>
+          <w:lang w:val="en-PK"/>
+        </w:rPr>
+        <w:t>common interface (API)</w:t>
+      </w:r>
+      <w:r>
+        <w:rPr>
+          <w:lang w:val="en-PK"/>
+        </w:rPr>
+        <w:t xml:space="preserve"> for logging, so that you can switch between different logging systems (called "backends") without changing your code.</w:t>
+      </w:r>
+    </w:p>
+    <w:p>
+      <w:pPr>
+        <w:rPr>
+          <w:lang w:val="en-PK"/>
+        </w:rPr>
+      </w:pPr>
+      <w:r>
+        <w:rPr>
+          <w:lang w:val="en-PK"/>
+        </w:rPr>
+        <w:pict w14:anchorId="46FA6EE2">
+          <v:rect id="_x0000_i1049" style="width:0;height:1.5pt" o:hralign="center" o:hrstd="t" o:hr="t" fillcolor="#a0a0a0" stroked="f"/>
+        </w:pict>
+      </w:r>
+    </w:p>
+    <w:p>
+      <w:pPr>
+        <w:rPr>
+          <w:b/>
+          <w:bCs/>
+          <w:lang w:val="en-PK"/>
+        </w:rPr>
+      </w:pPr>
+      <w:r>
+        <w:rPr>
+          <w:b/>
+          <w:bCs/>
+          <w:lang w:val="en-PK"/>
+        </w:rPr>
+        <w:t>Why is it useful?</w:t>
+      </w:r>
+    </w:p>
+    <w:p>
+      <w:pPr>
+        <w:rPr>
+          <w:lang w:val="en-PK"/>
+        </w:rPr>
+      </w:pPr>
+      <w:r>
+        <w:rPr>
+          <w:lang w:val="en-PK"/>
+        </w:rPr>
+        <w:t>In Java, there are many logging systems like:</w:t>
+      </w:r>
+    </w:p>
+    <w:p>
+      <w:pPr>
+        <w:numPr>
+          <w:ilvl w:val="0"/>
+          <w:numId w:val="5"/>
+        </w:numPr>
+        <w:rPr>
+          <w:lang w:val="en-PK"/>
+        </w:rPr>
+      </w:pPr>
+      <w:r>
+        <w:rPr>
+          <w:lang w:val="en-PK"/>
+        </w:rPr>
+        <w:t>Log4j</w:t>
+      </w:r>
+    </w:p>
+    <w:p>
+      <w:pPr>
+        <w:numPr>
+          <w:ilvl w:val="0"/>
+          <w:numId w:val="5"/>
+        </w:numPr>
+        <w:rPr>
+          <w:lang w:val="en-PK"/>
+        </w:rPr>
+      </w:pPr>
+      <w:r>
+        <w:rPr>
+          <w:lang w:val="en-PK"/>
+        </w:rPr>
+        <w:t>Logback</w:t>
+      </w:r>
+    </w:p>
+    <w:p>
+      <w:pPr>
+        <w:numPr>
+          <w:ilvl w:val="0"/>
+          <w:numId w:val="5"/>
+        </w:numPr>
+        <w:rPr>
+          <w:lang w:val="en-PK"/>
+        </w:rPr>
+      </w:pPr>
+      <w:r>
+        <w:rPr>
+          <w:lang w:val="en-PK"/>
+        </w:rPr>
+        <w:t>java.util.logging (JUL)</w:t>
+      </w:r>
+    </w:p>
+    <w:p>
+      <w:pPr>
+        <w:numPr>
+          <w:ilvl w:val="0"/>
+          <w:numId w:val="5"/>
+        </w:numPr>
+        <w:rPr>
+          <w:lang w:val="en-PK"/>
+        </w:rPr>
+      </w:pPr>
+      <w:r>
+        <w:rPr>
+          <w:lang w:val="en-PK"/>
+        </w:rPr>
+        <w:t>TinyLog</w:t>
+      </w:r>
+    </w:p>
+    <w:p>
+      <w:pPr>
+        <w:numPr>
+          <w:ilvl w:val="0"/>
+          <w:numId w:val="5"/>
+        </w:numPr>
+        <w:rPr>
+          <w:lang w:val="en-PK"/>
+        </w:rPr>
+      </w:pPr>
+      <w:r>
+        <w:rPr>
+          <w:lang w:val="en-PK"/>
+        </w:rPr>
+        <w:t>and others…</w:t>
+      </w:r>
+    </w:p>
+    <w:p>
+      <w:pPr>
+        <w:rPr>
+          <w:lang w:val="en-PK"/>
+        </w:rPr>
+      </w:pPr>
+      <w:r>
+        <w:rPr>
+          <w:lang w:val="en-PK"/>
+        </w:rPr>
+        <w:t xml:space="preserve">If you write your logging code directly using Log4j or Logback, you’re </w:t>
+      </w:r>
+      <w:r>
+        <w:rPr>
+          <w:b/>
+          <w:bCs/>
+          <w:lang w:val="en-PK"/>
+        </w:rPr>
+        <w:t>locked</w:t>
+      </w:r>
+      <w:r>
+        <w:rPr>
+          <w:lang w:val="en-PK"/>
+        </w:rPr>
+        <w:t xml:space="preserve"> into that system. But with </w:t>
+      </w:r>
+      <w:r>
+        <w:rPr>
+          <w:b/>
+          <w:bCs/>
+          <w:lang w:val="en-PK"/>
+        </w:rPr>
+        <w:t>SLF4J</w:t>
+      </w:r>
+      <w:r>
+        <w:rPr>
+          <w:lang w:val="en-PK"/>
+        </w:rPr>
+        <w:t>:</w:t>
+      </w:r>
+    </w:p>
+    <w:p>
+      <w:pPr>
+        <w:numPr>
+          <w:ilvl w:val="0"/>
+          <w:numId w:val="6"/>
+        </w:numPr>
+        <w:rPr>
+          <w:lang w:val="en-PK"/>
+        </w:rPr>
+      </w:pPr>
+      <w:r>
+        <w:rPr>
+          <w:lang w:val="en-PK"/>
+        </w:rPr>
+        <w:t>You write your logging code using SLF4J APIs.</w:t>
+      </w:r>
+    </w:p>
+    <w:p>
+      <w:pPr>
+        <w:numPr>
+          <w:ilvl w:val="0"/>
+          <w:numId w:val="6"/>
+        </w:numPr>
+        <w:rPr>
+          <w:lang w:val="en-PK"/>
+        </w:rPr>
+      </w:pPr>
+      <w:r>
+        <w:rPr>
+          <w:lang w:val="en-PK"/>
+        </w:rPr>
+        <w:t>At runtime, you plug in whichever logging backend you want (Logback, Log4j, etc.).</w:t>
+      </w:r>
+    </w:p>
+    <w:p>
+      <w:pPr>
+        <w:rPr>
+          <w:lang w:val="en-PK"/>
+        </w:rPr>
+      </w:pPr>
+      <w:r>
+        <w:rPr>
+          <w:lang w:val="en-PK"/>
+        </w:rPr>
+        <w:t xml:space="preserve">So, your code stays the same even if you change your logging system later. That’s called </w:t>
+      </w:r>
+      <w:r>
+        <w:rPr>
+          <w:b/>
+          <w:bCs/>
+          <w:lang w:val="en-PK"/>
+        </w:rPr>
+        <w:t>decoupling</w:t>
+      </w:r>
+      <w:r>
+        <w:rPr>
+          <w:lang w:val="en-PK"/>
+        </w:rPr>
+        <w:t>.</w:t>
+      </w:r>
+    </w:p>
+    <w:p>
+      <w:pPr>
+        <w:rPr>
+          <w:lang w:val="en-PK"/>
+        </w:rPr>
+      </w:pPr>
+      <w:r>
+        <w:rPr>
+          <w:lang w:val="en-PK"/>
+        </w:rPr>
+        <w:pict w14:anchorId="107CA0E8">
+          <v:rect id="_x0000_i1050" style="width:0;height:1.5pt" o:hralign="center" o:hrstd="t" o:hr="t" fillcolor="#a0a0a0" stroked="f"/>
+        </w:pict>
+      </w:r>
+    </w:p>
+    <w:p>
+      <w:pPr>
+        <w:rPr>
+          <w:b/>
+          <w:bCs/>
+          <w:lang w:val="en-PK"/>
+        </w:rPr>
+      </w:pPr>
+      <w:r>
+        <w:rPr>
+          <w:b/>
+          <w:bCs/>
+          <w:lang w:val="en-PK"/>
+        </w:rPr>
+        <w:lastRenderedPageBreak/>
+        <w:t>Example:</w:t>
+      </w:r>
+    </w:p>
+    <w:p>
+      <w:pPr>
+        <w:rPr>
+          <w:b/>
+          <w:bCs/>
+          <w:lang w:val="en-PK"/>
+        </w:rPr>
+      </w:pPr>
+      <w:r>
+        <w:rPr>
+          <w:b/>
+          <w:bCs/>
+          <w:lang w:val="en-PK"/>
+        </w:rPr>
+        <w:t>Using SLF4J in your code:</w:t>
+      </w:r>
+    </w:p>
+    <w:p>
+      <w:pPr>
+        <w:rPr>
+          <w:lang w:val="en-PK"/>
+        </w:rPr>
+      </w:pPr>
+      <w:r>
+        <w:rPr>
+          <w:lang w:val="en-PK"/>
+        </w:rPr>
+        <w:t>import org.slf4j.Logger;</w:t>
+      </w:r>
+    </w:p>
+    <w:p>
+      <w:pPr>
+        <w:rPr>
+          <w:lang w:val="en-PK"/>
+        </w:rPr>
+      </w:pPr>
+      <w:r>
+        <w:rPr>
+          <w:lang w:val="en-PK"/>
+        </w:rPr>
+        <w:t>import org.slf4j.LoggerFactory;</w:t>
+      </w:r>
+    </w:p>
+    <w:p>
+      <w:pPr>
+        <w:rPr>
+          <w:lang w:val="en-PK"/>
+        </w:rPr>
+      </w:pPr>
+    </w:p>
+    <w:p>
+      <w:pPr>
+        <w:rPr>
+          <w:lang w:val="en-PK"/>
+        </w:rPr>
+      </w:pPr>
+      <w:r>
+        <w:rPr>
+          <w:lang w:val="en-PK"/>
+        </w:rPr>
+        <w:t>public class MyApp {</w:t>
+      </w:r>
+    </w:p>
+    <w:p>
+      <w:pPr>
+        <w:rPr>
+          <w:lang w:val="en-PK"/>
+        </w:rPr>
+      </w:pPr>
+      <w:r>
+        <w:rPr>
+          <w:lang w:val="en-PK"/>
+        </w:rPr>
+        <w:t xml:space="preserve">    private static final Logger logger = LoggerFactory.getLogger(MyApp.class);</w:t>
+      </w:r>
+    </w:p>
+    <w:p>
+      <w:pPr>
+        <w:rPr>
+          <w:lang w:val="en-PK"/>
+        </w:rPr>
+      </w:pPr>
+    </w:p>
+    <w:p>
+      <w:pPr>
+        <w:rPr>
+          <w:lang w:val="en-PK"/>
+        </w:rPr>
+      </w:pPr>
+      <w:r>
+        <w:rPr>
+          <w:lang w:val="en-PK"/>
+        </w:rPr>
+        <w:t xml:space="preserve">    public static void main(String[] args) {</w:t>
+      </w:r>
+    </w:p>
+    <w:p>
+      <w:pPr>
+        <w:rPr>
+          <w:lang w:val="en-PK"/>
+        </w:rPr>
+      </w:pPr>
+      <w:r>
+        <w:rPr>
+          <w:lang w:val="en-PK"/>
+        </w:rPr>
+        <w:t xml:space="preserve">        logger.info("App is starting...");</w:t>
+      </w:r>
+    </w:p>
+    <w:p>
+      <w:pPr>
+        <w:rPr>
+          <w:lang w:val="en-PK"/>
+        </w:rPr>
+      </w:pPr>
+      <w:r>
+        <w:rPr>
+          <w:lang w:val="en-PK"/>
+        </w:rPr>
+        <w:t xml:space="preserve">        logger.error("Something went wrong!");</w:t>
+      </w:r>
+    </w:p>
+    <w:p>
+      <w:pPr>
+        <w:rPr>
+          <w:lang w:val="en-PK"/>
+        </w:rPr>
+      </w:pPr>
+      <w:r>
+        <w:rPr>
+          <w:lang w:val="en-PK"/>
+        </w:rPr>
+        <w:t xml:space="preserve">    }</w:t>
+      </w:r>
+    </w:p>
+    <w:p>
+      <w:pPr>
+        <w:rPr>
+          <w:lang w:val="en-PK"/>
+        </w:rPr>
+      </w:pPr>
+      <w:r>
+        <w:rPr>
+          <w:lang w:val="en-PK"/>
+        </w:rPr>
+        <w:t>}</w:t>
+      </w:r>
+    </w:p>
+    <w:p>
+      <w:pPr>
+        <w:rPr>
+          <w:b/>
+          <w:bCs/>
+          <w:lang w:val="en-PK"/>
+        </w:rPr>
+      </w:pPr>
+      <w:r>
+        <w:rPr>
+          <w:b/>
+          <w:bCs/>
+          <w:lang w:val="en-PK"/>
+        </w:rPr>
+        <w:t>At runtime:</w:t>
+      </w:r>
+    </w:p>
+    <w:p>
+      <w:pPr>
+        <w:numPr>
+          <w:ilvl w:val="0"/>
+          <w:numId w:val="7"/>
+        </w:numPr>
+        <w:rPr>
+          <w:lang w:val="en-PK"/>
+        </w:rPr>
+      </w:pPr>
+      <w:r>
+        <w:rPr>
+          <w:lang w:val="en-PK"/>
+        </w:rPr>
+        <w:t>If you use Logback as the backend, logs go through Logback.</w:t>
+      </w:r>
+    </w:p>
+    <w:p>
+      <w:pPr>
+        <w:numPr>
+          <w:ilvl w:val="0"/>
+          <w:numId w:val="7"/>
+        </w:numPr>
+        <w:rPr>
+          <w:lang w:val="en-PK"/>
+        </w:rPr>
+      </w:pPr>
+      <w:r>
+        <w:rPr>
+          <w:lang w:val="en-PK"/>
+        </w:rPr>
+        <w:t>If you switch to Log4j, the same code works — logs go through Log4j.</w:t>
+      </w:r>
+    </w:p>
+    <w:p>
+      <w:pPr>
+        <w:rPr>
+          <w:lang w:val="en-PK"/>
+        </w:rPr>
+      </w:pPr>
+      <w:r>
+        <w:rPr>
+          <w:lang w:val="en-PK"/>
+        </w:rPr>
+        <w:pict w14:anchorId="18359EBA">
+          <v:rect id="_x0000_i1051" style="width:0;height:1.5pt" o:hralign="center" o:hrstd="t" o:hr="t" fillcolor="#a0a0a0" stroked="f"/>
+        </w:pict>
+      </w:r>
+    </w:p>
+    <w:p>
+      <w:pPr>
+        <w:rPr>
+          <w:b/>
+          <w:bCs/>
+          <w:lang w:val="en-PK"/>
+        </w:rPr>
+      </w:pPr>
+      <w:r>
+        <w:rPr>
+          <w:b/>
+          <w:bCs/>
+          <w:lang w:val="en-PK"/>
+        </w:rPr>
+        <w:t>So how does this relate to Micrometer?</w:t>
+      </w:r>
+    </w:p>
+    <w:p>
+      <w:pPr>
+        <w:numPr>
+          <w:ilvl w:val="0"/>
+          <w:numId w:val="8"/>
+        </w:numPr>
+        <w:rPr>
+          <w:lang w:val="en-PK"/>
+        </w:rPr>
+      </w:pPr>
+      <w:r>
+        <w:rPr>
+          <w:b/>
+          <w:bCs/>
+          <w:lang w:val="en-PK"/>
+        </w:rPr>
+        <w:t>SLF4J</w:t>
+      </w:r>
+      <w:r>
+        <w:rPr>
+          <w:lang w:val="en-PK"/>
+        </w:rPr>
+        <w:t xml:space="preserve"> = facade for logging → lets you switch logging backends.</w:t>
+      </w:r>
+    </w:p>
+    <w:p>
+      <w:pPr>
+        <w:numPr>
+          <w:ilvl w:val="0"/>
+          <w:numId w:val="8"/>
+        </w:numPr>
+        <w:rPr>
+          <w:lang w:val="en-PK"/>
+        </w:rPr>
+      </w:pPr>
+      <w:r>
+        <w:rPr>
+          <w:b/>
+          <w:bCs/>
+          <w:lang w:val="en-PK"/>
+        </w:rPr>
+        <w:t>Micrometer</w:t>
+      </w:r>
+      <w:r>
+        <w:rPr>
+          <w:lang w:val="en-PK"/>
+        </w:rPr>
+        <w:t xml:space="preserve"> = facade for observability (metrics, tracing) → lets you switch monitoring backends (Prometheus, Datadog, etc.).</w:t>
+      </w:r>
+    </w:p>
+    <w:p>
+      <w:pPr>
+        <w:rPr>
+          <w:lang w:val="en-PK"/>
+        </w:rPr>
+      </w:pPr>
+      <w:r>
+        <w:rPr>
+          <w:lang w:val="en-PK"/>
+        </w:rPr>
+        <w:t xml:space="preserve">Same pattern. Both avoid </w:t>
+      </w:r>
+      <w:r>
+        <w:rPr>
+          <w:b/>
+          <w:bCs/>
+          <w:lang w:val="en-PK"/>
+        </w:rPr>
+        <w:t>vendor lock-in</w:t>
+      </w:r>
+      <w:r>
+        <w:rPr>
+          <w:lang w:val="en-PK"/>
+        </w:rPr>
+        <w:t>.</w:t>
+      </w:r>
+    </w:p>
+    <w:p>
+      <w:pPr>
+        <w:rPr>
+          <w:lang w:val="en-PK"/>
+        </w:rPr>
+      </w:pPr>
+    </w:p>
+    <w:p>
+      <w:pPr>
+        <w:rPr>
+          <w:lang w:val="en-PK"/>
+        </w:rPr>
+      </w:pPr>
+      <w:r>
+        <w:rPr>
+          <w:lang w:val="en-PK"/>
+        </w:rPr>
+        <w:t xml:space="preserve">Prometheus </w:t>
+      </w:r>
+      <w:r>
+        <w:rPr>
+          <w:lang w:val="en-PK"/>
+        </w:rPr>
+        <w:t xml:space="preserve">is an </w:t>
+      </w:r>
+      <w:r>
+        <w:rPr>
+          <w:lang w:val="en-PK"/>
+        </w:rPr>
+        <w:t xml:space="preserve">OPEN SOURCE </w:t>
+      </w:r>
+      <w:r>
+        <w:rPr>
+          <w:lang w:val="en-PK"/>
+        </w:rPr>
+        <w:t>monitoring solution.</w:t>
+      </w:r>
+      <w:r>
+        <w:rPr>
+          <w:lang w:val="en-PK"/>
+        </w:rPr>
+        <w:t xml:space="preserve"> It provides UI.</w:t>
+      </w:r>
+      <w:r>
+        <w:rPr>
+          <w:lang w:val="en-PK"/>
+        </w:rPr>
+        <w:t xml:space="preserve"> We can’t build complex dashboards along with Prometheus so we need Grafana tool as well.</w:t>
+      </w:r>
+    </w:p>
+    <w:p>
+      <w:pPr>
+        <w:rPr>
+          <w:lang w:val="en-PK"/>
+        </w:rPr>
+      </w:pPr>
+    </w:p>
+    <w:p>
+      <w:pPr>
+        <w:rPr>
+          <w:lang w:val="en-PK"/>
+        </w:rPr>
+      </w:pPr>
+      <w:r>
+        <w:rPr>
+          <w:lang w:val="en-PK"/>
+        </w:rPr>
+        <w:t>It will tell to which microservice logs belong to</w:t>
+      </w:r>
+      <w:r>
+        <w:rPr>
+          <w:lang w:val="en-PK"/>
+        </w:rPr>
+        <w:br/>
+      </w:r>
+      <w:r>
+        <w:rPr>
+          <w:i/>
+          <w:iCs/>
+          <w:lang w:val="en-PK"/>
+        </w:rPr>
+        <w:t>metrics</w:t>
+      </w:r>
+      <w:r>
+        <w:rPr>
+          <w:lang w:val="en-PK"/>
+        </w:rPr>
+        <w:t>:</w:t>
+      </w:r>
+      <w:r>
+        <w:rPr>
+          <w:lang w:val="en-PK"/>
+        </w:rPr>
+        <w:br/>
+        <w:t xml:space="preserve">  </w:t>
+      </w:r>
+      <w:r>
+        <w:rPr>
+          <w:i/>
+          <w:iCs/>
+          <w:lang w:val="en-PK"/>
+        </w:rPr>
+        <w:t>tags</w:t>
+      </w:r>
+      <w:r>
+        <w:rPr>
+          <w:lang w:val="en-PK"/>
+        </w:rPr>
+        <w:t>:</w:t>
+      </w:r>
+      <w:r>
+        <w:rPr>
+          <w:lang w:val="en-PK"/>
+        </w:rPr>
+        <w:br/>
+        <w:t xml:space="preserve">    </w:t>
+      </w:r>
+      <w:r>
+        <w:rPr>
+          <w:i/>
+          <w:iCs/>
+          <w:lang w:val="en-PK"/>
+        </w:rPr>
+        <w:t>application</w:t>
+      </w:r>
+      <w:r>
+        <w:rPr>
+          <w:lang w:val="en-PK"/>
+        </w:rPr>
+        <w:t>: ${spring.application.name}</w:t>
+      </w:r>
+    </w:p>
+    <w:p>
+      <w:pPr>
+        <w:rPr>
+          <w:lang w:val="en-PK"/>
+        </w:rPr>
+      </w:pPr>
+    </w:p>
+    <w:p>
+      <w:pPr>
+        <w:rPr>
+          <w:lang w:val="en-PK"/>
+        </w:rPr>
+      </w:pPr>
+    </w:p>
+    <w:p>
+      <w:pPr>
+        <w:rPr>
+          <w:b/>
+          <w:bCs/>
+          <w:lang w:val="en-PK"/>
+        </w:rPr>
+      </w:pPr>
+      <w:r>
+        <w:rPr>
+          <w:b/>
+          <w:bCs/>
+          <w:lang w:val="en-PK"/>
+        </w:rPr>
+        <w:lastRenderedPageBreak/>
+        <w:t>To check metrics:</w:t>
+      </w:r>
+    </w:p>
+    <w:p>
+      <w:pPr>
+        <w:rPr>
+          <w:lang w:val="en-PK"/>
+        </w:rPr>
+      </w:pPr>
+      <w:hyperlink r:id="rId6" w:history="1">
+        <w:r>
+          <w:rPr>
+            <w:rStyle w:val="Hyperlink"/>
+            <w:lang w:val="en-PK"/>
+          </w:rPr>
+          <w:t>http://localhost:8080/actuator/metrics/process.uptime</w:t>
+        </w:r>
+      </w:hyperlink>
+      <w:r>
+        <w:rPr>
+          <w:lang w:val="en-PK"/>
+        </w:rPr>
+        <w:t xml:space="preserve"> up time</w:t>
+      </w:r>
+    </w:p>
+    <w:p>
+      <w:pPr>
+        <w:rPr>
+          <w:lang w:val="en-PK"/>
+        </w:rPr>
+      </w:pPr>
+      <w:r>
+        <w:rPr>
+          <w:lang w:val="en-PK"/>
+        </w:rPr>
+        <w:t>you can also other metrices from here</w:t>
+      </w:r>
+      <w:r>
+        <w:rPr>
+          <w:lang w:val="en-PK"/>
+        </w:rPr>
+        <w:t xml:space="preserve"> </w:t>
+      </w:r>
+      <w:hyperlink r:id="rId7" w:history="1">
+        <w:r>
+          <w:rPr>
+            <w:rStyle w:val="Hyperlink"/>
+            <w:lang w:val="en-PK"/>
+          </w:rPr>
+          <w:t>http://localhost:8080/actuator/metrics</w:t>
+        </w:r>
+      </w:hyperlink>
+    </w:p>
+    <w:p>
+      <w:pPr>
+        <w:rPr>
+          <w:lang w:val="en-PK"/>
+        </w:rPr>
+      </w:pPr>
+      <w:r>
+        <w:rPr>
+          <w:lang w:val="en-PK"/>
+        </w:rPr>
+        <w:t xml:space="preserve">All microservices exposing actuator in a format that can understand by Prometheus </w:t>
+      </w:r>
+    </w:p>
+    <w:p>
+      <w:pPr>
+        <w:rPr>
+          <w:lang w:val="en-PK"/>
+        </w:rPr>
+      </w:pPr>
+      <w:hyperlink r:id="rId8" w:history="1">
+        <w:r>
+          <w:rPr>
+            <w:rStyle w:val="Hyperlink"/>
+            <w:lang w:val="en-PK"/>
+          </w:rPr>
+          <w:t>http://localhost:8080/actuator/prometheus</w:t>
+        </w:r>
+      </w:hyperlink>
+    </w:p>
+    <w:p>
+      <w:pPr>
+        <w:rPr>
+          <w:lang w:val="en-PK"/>
+        </w:rPr>
+      </w:pPr>
+    </w:p>
+    <w:p>
+      <w:pPr>
+        <w:rPr>
+          <w:lang w:val="en-PK"/>
+        </w:rPr>
+      </w:pPr>
+      <w:r>
+        <w:rPr>
+          <w:lang w:val="en-PK"/>
+        </w:rPr>
+        <w:t xml:space="preserve">We integrated Grafana with </w:t>
+      </w:r>
+      <w:r>
+        <w:rPr>
+          <w:lang w:val="en-PK"/>
+        </w:rPr>
+        <w:t>Prometheus</w:t>
+      </w:r>
+    </w:p>
+    <w:p>
+      <w:pPr>
+        <w:rPr>
+          <w:lang w:val="en-PK"/>
+        </w:rPr>
+      </w:pPr>
+    </w:p>
+    <w:p>
+      <w:pPr>
+        <w:rPr>
+          <w:lang w:val="en-PK"/>
+        </w:rPr>
+      </w:pPr>
+      <w:r>
+        <w:rPr>
+          <w:b/>
+          <w:bCs/>
+          <w:lang w:val="en-PK"/>
+        </w:rPr>
+        <w:t>Distributed Tracing</w:t>
+      </w:r>
+      <w:r>
+        <w:rPr>
+          <w:lang w:val="en-PK"/>
+        </w:rPr>
+        <w:t xml:space="preserve"> to track the path of request through different microservices.</w:t>
+      </w:r>
+      <w:r>
+        <w:rPr>
+          <w:lang w:val="en-PK"/>
+        </w:rPr>
+        <w:t xml:space="preserve"> Generate a unique correlation ID that will go through the all microservices.</w:t>
+      </w:r>
+    </w:p>
+    <w:p>
+      <w:pPr>
+        <w:rPr>
+          <w:lang w:val="en-PK"/>
+        </w:rPr>
+      </w:pPr>
+      <w:r>
+        <w:rPr>
+          <w:lang w:val="en-PK"/>
+        </w:rPr>
+        <w:t>Trace ID, collections of actions tied to a ID, span ID inside all microservices.</w:t>
+      </w:r>
+      <w:r>
+        <w:rPr>
+          <w:lang w:val="en-PK"/>
+        </w:rPr>
+        <w:t xml:space="preserve"> Trace ID will remain same for all microservices, Tag will change</w:t>
+      </w:r>
+      <w:r>
+        <w:rPr>
+          <w:lang w:val="en-PK"/>
+        </w:rPr>
+        <w:t xml:space="preserve"> and Span ID also change according to microservices.</w:t>
+      </w:r>
+    </w:p>
+    <w:p>
+      <w:pPr>
+        <w:rPr>
+          <w:lang w:val="en-PK"/>
+        </w:rPr>
+      </w:pPr>
+    </w:p>
+    <w:p>
+      <w:pPr>
+        <w:rPr>
+          <w:lang w:val="en-PK"/>
+        </w:rPr>
+      </w:pPr>
+      <w:r>
+        <w:rPr>
+          <w:lang w:val="en-PK"/>
+        </w:rPr>
+        <w:t xml:space="preserve">To implement it we </w:t>
+      </w:r>
+      <w:r>
+        <w:rPr>
+          <w:lang w:val="en-PK"/>
+        </w:rPr>
+        <w:t xml:space="preserve">can </w:t>
+      </w:r>
+      <w:r>
+        <w:rPr>
+          <w:lang w:val="en-PK"/>
+        </w:rPr>
+        <w:t>use spring cloud sleuth</w:t>
+      </w:r>
+      <w:r>
+        <w:rPr>
+          <w:lang w:val="en-PK"/>
+        </w:rPr>
+        <w:t>, another is</w:t>
+      </w:r>
+      <w:r>
+        <w:rPr>
+          <w:lang w:val="en-PK"/>
+        </w:rPr>
+        <w:t xml:space="preserve"> MICROMETER</w:t>
+      </w:r>
+      <w:r>
+        <w:rPr>
+          <w:lang w:val="en-PK"/>
+        </w:rPr>
+        <w:t xml:space="preserve"> requires a lot of </w:t>
+      </w:r>
+      <w:r>
+        <w:rPr>
+          <w:lang w:val="en-PK"/>
+        </w:rPr>
+        <w:t>configurations</w:t>
+      </w:r>
+      <w:r>
+        <w:rPr>
+          <w:lang w:val="en-PK"/>
+        </w:rPr>
+        <w:t>, so we can use open telemetry</w:t>
+      </w:r>
+      <w:r>
+        <w:rPr>
+          <w:lang w:val="en-PK"/>
+        </w:rPr>
+        <w:t xml:space="preserve"> so it is supported for multiple apps.</w:t>
+      </w:r>
+    </w:p>
+    <w:p>
+      <w:pPr>
+        <w:rPr>
+          <w:lang w:val="en-PK"/>
+        </w:rPr>
+      </w:pPr>
+    </w:p>
+    <w:p>
+      <w:pPr>
+        <w:pStyle w:val="ListParagraph"/>
+        <w:numPr>
+          <w:ilvl w:val="0"/>
+          <w:numId w:val="12"/>
+        </w:numPr>
+        <w:rPr>
+          <w:lang w:val="en-PK"/>
+        </w:rPr>
+      </w:pPr>
+      <w:r>
+        <w:rPr>
+          <w:lang w:val="en-PK"/>
+        </w:rPr>
+        <w:t>Add dependencies</w:t>
+      </w:r>
+      <w:r>
+        <w:rPr>
+          <w:lang w:val="en-PK"/>
+        </w:rPr>
+        <w:t xml:space="preserve"> for open telemetry in app.</w:t>
+      </w:r>
+    </w:p>
+    <w:p>
+      <w:pPr>
+        <w:rPr>
+          <w:lang w:val="en-PK"/>
+        </w:rPr>
+      </w:pPr>
+      <w:r>
+        <w:rPr>
+          <w:lang w:val="en-PK"/>
+        </w:rPr>
+        <w:t>pattern:</w:t>
+      </w:r>
+    </w:p>
+    <w:p>
+      <w:pPr>
+        <w:rPr>
+          <w:lang w:val="en-PK"/>
+        </w:rPr>
+      </w:pPr>
+      <w:r>
+        <w:rPr>
+          <w:lang w:val="en-PK"/>
+        </w:rPr>
+        <w:t xml:space="preserve">  level: "%5p [${spring.application.name},%X{trace_id},%X{span_id}]"</w:t>
+      </w:r>
+    </w:p>
+    <w:p>
+      <w:pPr>
+        <w:rPr>
+          <w:lang w:val="en-PK"/>
+        </w:rPr>
+      </w:pPr>
+      <w:r>
+        <w:rPr>
+          <w:lang w:val="en-PK"/>
+        </w:rPr>
+        <w:t>It will attach byte code to my app at runtime.</w:t>
+      </w:r>
+      <w:r>
+        <w:rPr>
+          <w:lang w:val="en-PK"/>
+        </w:rPr>
+        <w:t xml:space="preserve"> Inside Grafana, we will use temp for tracing information.</w:t>
+      </w:r>
+    </w:p>
+    <w:p>
+      <w:pPr>
+        <w:rPr>
+          <w:lang w:val="en-PK"/>
+        </w:rPr>
+      </w:pPr>
+      <w:r>
+        <w:rPr>
+          <w:lang w:val="en-PK"/>
+        </w:rPr>
+        <w:pict w14:anchorId="4869B40C">
+          <v:rect id="_x0000_i1082" style="width:0;height:1.5pt" o:hralign="center" o:hrstd="t" o:hr="t" fillcolor="#a0a0a0" stroked="f"/>
+        </w:pict>
+      </w:r>
+    </w:p>
+    <w:p>
+      <w:pPr>
+        <w:rPr>
+          <w:b/>
+          <w:bCs/>
+          <w:lang w:val="en-PK"/>
+        </w:rPr>
+      </w:pPr>
+      <w:r>
+        <w:rPr>
+          <w:rFonts w:ascii="Segoe UI Emoji" w:hAnsi="Segoe UI Emoji" w:cs="Segoe UI Emoji"/>
+          <w:b/>
+          <w:bCs/>
+          <w:lang w:val="en-PK"/>
+        </w:rPr>
+        <w:t>🔎</w:t>
+      </w:r>
+      <w:r>
+        <w:rPr>
+          <w:b/>
+          <w:bCs/>
+          <w:lang w:val="en-PK"/>
+        </w:rPr>
+        <w:t xml:space="preserve"> Focus on %5p first:</w:t>
+      </w:r>
+    </w:p>
+    <w:p>
+      <w:pPr>
+        <w:numPr>
+          <w:ilvl w:val="0"/>
+          <w:numId w:val="9"/>
+        </w:numPr>
+        <w:rPr>
+          <w:lang w:val="en-PK"/>
+        </w:rPr>
+      </w:pPr>
+      <w:r>
+        <w:rPr>
+          <w:b/>
+          <w:bCs/>
+          <w:lang w:val="en-PK"/>
+        </w:rPr>
+        <w:t>%p</w:t>
+      </w:r>
+      <w:r>
+        <w:rPr>
+          <w:lang w:val="en-PK"/>
+        </w:rPr>
+        <w:t xml:space="preserve"> → This is from SLF4J / Logback / Log4j pattern layout. It stands for the </w:t>
+      </w:r>
+      <w:r>
+        <w:rPr>
+          <w:b/>
+          <w:bCs/>
+          <w:lang w:val="en-PK"/>
+        </w:rPr>
+        <w:t>log level</w:t>
+      </w:r>
+      <w:r>
+        <w:rPr>
+          <w:lang w:val="en-PK"/>
+        </w:rPr>
+        <w:t xml:space="preserve"> (like INFO, DEBUG, ERROR, etc.).</w:t>
+      </w:r>
+    </w:p>
+    <w:p>
+      <w:pPr>
+        <w:numPr>
+          <w:ilvl w:val="0"/>
+          <w:numId w:val="9"/>
+        </w:numPr>
+        <w:rPr>
+          <w:lang w:val="en-PK"/>
+        </w:rPr>
+      </w:pPr>
+      <w:r>
+        <w:rPr>
+          <w:b/>
+          <w:bCs/>
+          <w:lang w:val="en-PK"/>
+        </w:rPr>
+        <w:t>5</w:t>
+      </w:r>
+      <w:r>
+        <w:rPr>
+          <w:lang w:val="en-PK"/>
+        </w:rPr>
+        <w:t xml:space="preserve"> → This is the </w:t>
+      </w:r>
+      <w:r>
+        <w:rPr>
+          <w:b/>
+          <w:bCs/>
+          <w:lang w:val="en-PK"/>
+        </w:rPr>
+        <w:t>minimum width</w:t>
+      </w:r>
+      <w:r>
+        <w:rPr>
+          <w:lang w:val="en-PK"/>
+        </w:rPr>
+        <w:t xml:space="preserve">. It means the log level should take </w:t>
+      </w:r>
+      <w:r>
+        <w:rPr>
+          <w:b/>
+          <w:bCs/>
+          <w:lang w:val="en-PK"/>
+        </w:rPr>
+        <w:t>at least 5 characters</w:t>
+      </w:r>
+      <w:r>
+        <w:rPr>
+          <w:lang w:val="en-PK"/>
+        </w:rPr>
+        <w:t xml:space="preserve">, and if it's shorter, it will be </w:t>
+      </w:r>
+      <w:r>
+        <w:rPr>
+          <w:b/>
+          <w:bCs/>
+          <w:lang w:val="en-PK"/>
+        </w:rPr>
+        <w:t>padded with spaces</w:t>
+      </w:r>
+      <w:r>
+        <w:rPr>
+          <w:lang w:val="en-PK"/>
+        </w:rPr>
+        <w:t xml:space="preserve"> on the left.</w:t>
+      </w:r>
+    </w:p>
+    <w:p>
+      <w:pPr>
+        <w:rPr>
+          <w:b/>
+          <w:bCs/>
+          <w:lang w:val="en-PK"/>
+        </w:rPr>
+      </w:pPr>
+      <w:r>
+        <w:rPr>
+          <w:b/>
+          <w:bCs/>
+          <w:lang w:val="en-PK"/>
+        </w:rPr>
+        <w:t>Example:</w:t>
+      </w:r>
+    </w:p>
+    <w:tbl>
+      <w:tblPr>
+        <w:tblW w:w="0" w:type="auto"/>
+        <w:tblCellSpacing w:w="15" w:type="dxa"/>
+        <w:tblCellMar>
+          <w:top w:w="15" w:type="dxa"/>
+          <w:left w:w="15" w:type="dxa"/>
+          <w:bottom w:w="15" w:type="dxa"/>
+          <w:right w:w="15" w:type="dxa"/>
+        </w:tblCellMar>
+        <w:tblLook w:val="04A0" w:firstRow="1" w:lastRow="0" w:firstColumn="1" w:lastColumn="0" w:noHBand="0" w:noVBand="1"/>
+      </w:tblPr>
+      <w:tblGrid>
+        <w:gridCol w:w="1095"/>
+        <w:gridCol w:w="2468"/>
+      </w:tblGrid>
+      <w:tr>
+        <w:trPr>
+          <w:tblHeader/>
+          <w:tblCellSpacing w:w="15" w:type="dxa"/>
+        </w:trPr>
+        <w:tc>
+          <w:tcPr>
+            <w:tcW w:w="0" w:type="auto"/>
+            <w:vAlign w:val="center"/>
+            <w:hideMark/>
+          </w:tcPr>
+          <w:p>
+            <w:pPr>
+              <w:rPr>
+                <w:b/>
+                <w:bCs/>
+                <w:lang w:val="en-PK"/>
+              </w:rPr>
+            </w:pPr>
+            <w:r>
+              <w:rPr>
+                <w:b/>
+                <w:bCs/>
+                <w:lang w:val="en-PK"/>
+              </w:rPr>
+              <w:t>Log Level</w:t>
+            </w:r>
+          </w:p>
+        </w:tc>
+        <w:tc>
+          <w:tcPr>
+            <w:tcW w:w="0" w:type="auto"/>
+            <w:vAlign w:val="center"/>
+            <w:hideMark/>
+          </w:tcPr>
+          <w:p>
+            <w:pPr>
+              <w:rPr>
+                <w:b/>
+                <w:bCs/>
+                <w:lang w:val="en-PK"/>
+              </w:rPr>
+            </w:pPr>
+            <w:r>
+              <w:rPr>
+                <w:b/>
+                <w:bCs/>
+                <w:lang w:val="en-PK"/>
+              </w:rPr>
+              <w:t>%5p Output</w:t>
+            </w:r>
+          </w:p>
+        </w:tc>
+      </w:tr>
+      <w:tr>
+        <w:trPr>
+          <w:tblCellSpacing w:w="15" w:type="dxa"/>
+        </w:trPr>
+        <w:tc>
+          <w:tcPr>
+            <w:tcW w:w="0" w:type="auto"/>
+            <w:vAlign w:val="center"/>
+            <w:hideMark/>
+          </w:tcPr>
+          <w:p>
+            <w:pPr>
+              <w:rPr>
+                <w:lang w:val="en-PK"/>
+              </w:rPr>
+            </w:pPr>
+            <w:r>
+              <w:rPr>
+                <w:lang w:val="en-PK"/>
+              </w:rPr>
+              <w:t>INFO</w:t>
+            </w:r>
+          </w:p>
+        </w:tc>
+        <w:tc>
+          <w:tcPr>
+            <w:tcW w:w="0" w:type="auto"/>
+            <w:vAlign w:val="center"/>
+            <w:hideMark/>
+          </w:tcPr>
+          <w:p>
+            <w:pPr>
+              <w:rPr>
+                <w:lang w:val="en-PK"/>
+              </w:rPr>
+            </w:pPr>
+            <w:r>
+              <w:rPr>
+                <w:lang w:val="en-PK"/>
+              </w:rPr>
+              <w:t>INFO (1 space padded)</w:t>
+            </w:r>
+          </w:p>
+        </w:tc>
+      </w:tr>
+      <w:tr>
+        <w:trPr>
+          <w:tblCellSpacing w:w="15" w:type="dxa"/>
+        </w:trPr>
+        <w:tc>
+          <w:tcPr>
+            <w:tcW w:w="0" w:type="auto"/>
+            <w:vAlign w:val="center"/>
+            <w:hideMark/>
+          </w:tcPr>
+          <w:p>
+            <w:pPr>
+              <w:rPr>
+                <w:lang w:val="en-PK"/>
+              </w:rPr>
+            </w:pPr>
+            <w:r>
+              <w:rPr>
+                <w:lang w:val="en-PK"/>
+              </w:rPr>
+              <w:t>DEBUG</w:t>
+            </w:r>
+          </w:p>
+        </w:tc>
+        <w:tc>
+          <w:tcPr>
+            <w:tcW w:w="0" w:type="auto"/>
+            <w:vAlign w:val="center"/>
+            <w:hideMark/>
+          </w:tcPr>
+          <w:p>
+            <w:pPr>
+              <w:rPr>
+                <w:lang w:val="en-PK"/>
+              </w:rPr>
+            </w:pPr>
+            <w:r>
+              <w:rPr>
+                <w:lang w:val="en-PK"/>
+              </w:rPr>
+              <w:t>DEBUG (exact 5 chars)</w:t>
+            </w:r>
+          </w:p>
+        </w:tc>
+      </w:tr>
+      <w:tr>
+        <w:trPr>
+          <w:tblCellSpacing w:w="15" w:type="dxa"/>
+        </w:trPr>
+        <w:tc>
+          <w:tcPr>
+            <w:tcW w:w="0" w:type="auto"/>
+            <w:vAlign w:val="center"/>
+            <w:hideMark/>
+          </w:tcPr>
+          <w:p>
+            <w:pPr>
+              <w:rPr>
+                <w:lang w:val="en-PK"/>
+              </w:rPr>
+            </w:pPr>
+            <w:r>
+              <w:rPr>
+                <w:lang w:val="en-PK"/>
+              </w:rPr>
+              <w:lastRenderedPageBreak/>
+              <w:t>ERROR</w:t>
+            </w:r>
+          </w:p>
+        </w:tc>
+        <w:tc>
+          <w:tcPr>
+            <w:tcW w:w="0" w:type="auto"/>
+            <w:vAlign w:val="center"/>
+            <w:hideMark/>
+          </w:tcPr>
+          <w:p>
+            <w:pPr>
+              <w:rPr>
+                <w:lang w:val="en-PK"/>
+              </w:rPr>
+            </w:pPr>
+            <w:r>
+              <w:rPr>
+                <w:lang w:val="en-PK"/>
+              </w:rPr>
+              <w:t>ERROR (exact 5 chars)</w:t>
+            </w:r>
+          </w:p>
+        </w:tc>
+      </w:tr>
+      <w:tr>
+        <w:trPr>
+          <w:tblCellSpacing w:w="15" w:type="dxa"/>
+        </w:trPr>
+        <w:tc>
+          <w:tcPr>
+            <w:tcW w:w="0" w:type="auto"/>
+            <w:vAlign w:val="center"/>
+            <w:hideMark/>
+          </w:tcPr>
+          <w:p>
+            <w:pPr>
+              <w:rPr>
+                <w:lang w:val="en-PK"/>
+              </w:rPr>
+            </w:pPr>
+            <w:r>
+              <w:rPr>
+                <w:lang w:val="en-PK"/>
+              </w:rPr>
+              <w:t>WARN</w:t>
+            </w:r>
+          </w:p>
+        </w:tc>
+        <w:tc>
+          <w:tcPr>
+            <w:tcW w:w="0" w:type="auto"/>
+            <w:vAlign w:val="center"/>
+            <w:hideMark/>
+          </w:tcPr>
+          <w:p>
+            <w:pPr>
+              <w:rPr>
+                <w:lang w:val="en-PK"/>
+              </w:rPr>
+            </w:pPr>
+            <w:r>
+              <w:rPr>
+                <w:lang w:val="en-PK"/>
+              </w:rPr>
+              <w:t>WARN (1 space padded)</w:t>
+            </w:r>
+          </w:p>
+        </w:tc>
+      </w:tr>
+    </w:tbl>
+    <w:p>
+      <w:pPr>
+        <w:rPr>
+          <w:lang w:val="en-PK"/>
+        </w:rPr>
+      </w:pPr>
+      <w:r>
+        <w:rPr>
+          <w:rFonts w:ascii="Segoe UI Symbol" w:hAnsi="Segoe UI Symbol" w:cs="Segoe UI Symbol"/>
+          <w:lang w:val="en-PK"/>
+        </w:rPr>
+        <w:t>➡</w:t>
+      </w:r>
+      <w:r>
+        <w:rPr>
+          <w:lang w:val="en-PK"/>
+        </w:rPr>
+        <w:t>️ Purpose: So that the log levels align neatly in columns when you read logs!</w:t>
+      </w:r>
+    </w:p>
+    <w:p>
+      <w:pPr>
+        <w:rPr>
+          <w:lang w:val="en-PK"/>
+        </w:rPr>
+      </w:pPr>
+      <w:r>
+        <w:rPr>
+          <w:lang w:val="en-PK"/>
+        </w:rPr>
+        <w:pict w14:anchorId="1A2D0063">
+          <v:rect id="_x0000_i1083" style="width:0;height:1.5pt" o:hralign="center" o:hrstd="t" o:hr="t" fillcolor="#a0a0a0" stroked="f"/>
+        </w:pict>
+      </w:r>
+    </w:p>
+    <w:p>
+      <w:pPr>
+        <w:rPr>
+          <w:b/>
+          <w:bCs/>
+          <w:lang w:val="en-PK"/>
+        </w:rPr>
+      </w:pPr>
+      <w:r>
+        <w:rPr>
+          <w:rFonts w:ascii="Segoe UI Emoji" w:hAnsi="Segoe UI Emoji" w:cs="Segoe UI Emoji"/>
+          <w:b/>
+          <w:bCs/>
+          <w:lang w:val="en-PK"/>
+        </w:rPr>
+        <w:t>🔎</w:t>
+      </w:r>
+      <w:r>
+        <w:rPr>
+          <w:b/>
+          <w:bCs/>
+          <w:lang w:val="en-PK"/>
+        </w:rPr>
+        <w:t xml:space="preserve"> Now, rest of your pattern:</w:t>
+      </w:r>
+    </w:p>
+    <w:p>
+      <w:pPr>
+        <w:rPr>
+          <w:lang w:val="en-PK"/>
+        </w:rPr>
+      </w:pPr>
+      <w:r>
+        <w:rPr>
+          <w:lang w:val="en-PK"/>
+        </w:rPr>
+        <w:t>%5p [${spring.application.name},%X{trace_id},%X{span_id}]</w:t>
+      </w:r>
+    </w:p>
+    <w:p>
+      <w:pPr>
+        <w:numPr>
+          <w:ilvl w:val="0"/>
+          <w:numId w:val="10"/>
+        </w:numPr>
+        <w:rPr>
+          <w:lang w:val="en-PK"/>
+        </w:rPr>
+      </w:pPr>
+      <w:r>
+        <w:rPr>
+          <w:b/>
+          <w:bCs/>
+          <w:lang w:val="en-PK"/>
+        </w:rPr>
+        <w:t>${spring.application.name}</w:t>
+      </w:r>
+      <w:r>
+        <w:rPr>
+          <w:lang w:val="en-PK"/>
+        </w:rPr>
+        <w:t xml:space="preserve"> → Injects your app's name (from application.properties).</w:t>
+      </w:r>
+    </w:p>
+    <w:p>
+      <w:pPr>
+        <w:numPr>
+          <w:ilvl w:val="0"/>
+          <w:numId w:val="10"/>
+        </w:numPr>
+        <w:rPr>
+          <w:lang w:val="en-PK"/>
+        </w:rPr>
+      </w:pPr>
+      <w:r>
+        <w:rPr>
+          <w:b/>
+          <w:bCs/>
+          <w:lang w:val="en-PK"/>
+        </w:rPr>
+        <w:t>%X{trace_id}</w:t>
+      </w:r>
+      <w:r>
+        <w:rPr>
+          <w:lang w:val="en-PK"/>
+        </w:rPr>
+        <w:t xml:space="preserve"> → Gets the </w:t>
+      </w:r>
+      <w:r>
+        <w:rPr>
+          <w:b/>
+          <w:bCs/>
+          <w:lang w:val="en-PK"/>
+        </w:rPr>
+        <w:t>trace ID</w:t>
+      </w:r>
+      <w:r>
+        <w:rPr>
+          <w:lang w:val="en-PK"/>
+        </w:rPr>
+        <w:t xml:space="preserve"> from the logging context (used in tracing).</w:t>
+      </w:r>
+    </w:p>
+    <w:p>
+      <w:pPr>
+        <w:numPr>
+          <w:ilvl w:val="0"/>
+          <w:numId w:val="10"/>
+        </w:numPr>
+        <w:rPr>
+          <w:lang w:val="en-PK"/>
+        </w:rPr>
+      </w:pPr>
+      <w:r>
+        <w:rPr>
+          <w:b/>
+          <w:bCs/>
+          <w:lang w:val="en-PK"/>
+        </w:rPr>
+        <w:t>%X{span_id}</w:t>
+      </w:r>
+      <w:r>
+        <w:rPr>
+          <w:lang w:val="en-PK"/>
+        </w:rPr>
+        <w:t xml:space="preserve"> → Gets the </w:t>
+      </w:r>
+      <w:r>
+        <w:rPr>
+          <w:b/>
+          <w:bCs/>
+          <w:lang w:val="en-PK"/>
+        </w:rPr>
+        <w:t>span ID</w:t>
+      </w:r>
+      <w:r>
+        <w:rPr>
+          <w:lang w:val="en-PK"/>
+        </w:rPr>
+        <w:t xml:space="preserve"> from the logging context (used in tracing).</w:t>
+      </w:r>
+    </w:p>
+    <w:p>
+      <w:pPr>
+        <w:rPr>
+          <w:lang w:val="en-PK"/>
+        </w:rPr>
+      </w:pPr>
+      <w:r>
+        <w:rPr>
+          <w:lang w:val="en-PK"/>
+        </w:rPr>
+        <w:pict w14:anchorId="4B748924">
+          <v:rect id="_x0000_i1084" style="width:0;height:1.5pt" o:hralign="center" o:hrstd="t" o:hr="t" fillcolor="#a0a0a0" stroked="f"/>
+        </w:pict>
+      </w:r>
+    </w:p>
+    <w:p>
+      <w:pPr>
+        <w:rPr>
+          <w:b/>
+          <w:bCs/>
+          <w:lang w:val="en-PK"/>
+        </w:rPr>
+      </w:pPr>
+      <w:r>
+        <w:rPr>
+          <w:rFonts w:ascii="Segoe UI Emoji" w:hAnsi="Segoe UI Emoji" w:cs="Segoe UI Emoji"/>
+          <w:b/>
+          <w:bCs/>
+          <w:lang w:val="en-PK"/>
+        </w:rPr>
+        <w:t>✅</w:t>
+      </w:r>
+      <w:r>
+        <w:rPr>
+          <w:b/>
+          <w:bCs/>
+          <w:lang w:val="en-PK"/>
+        </w:rPr>
+        <w:t xml:space="preserve"> Example of how your log line would look:</w:t>
+      </w:r>
+    </w:p>
+    <w:p>
+      <w:pPr>
+        <w:rPr>
+          <w:lang w:val="en-PK"/>
+        </w:rPr>
+      </w:pPr>
+      <w:r>
+        <w:rPr>
+          <w:lang w:val="en-PK"/>
+        </w:rPr>
+        <w:t xml:space="preserve"> INFO [my-spring-app,9f8d12e1b2c8fabc,4a6f1c3e2b9a7def]</w:t>
+      </w:r>
+    </w:p>
+    <w:p>
+      <w:pPr>
+        <w:rPr>
+          <w:lang w:val="en-PK"/>
+        </w:rPr>
+      </w:pPr>
+      <w:r>
+        <w:rPr>
+          <w:lang w:val="en-PK"/>
+        </w:rPr>
+        <w:t>DEBUG [my-spring-app,9f8d12e1b2c8fabc,7c3b8d9a1f2e4cd1]</w:t>
+      </w:r>
+    </w:p>
+    <w:p>
+      <w:pPr>
+        <w:rPr>
+          <w:lang w:val="en-PK"/>
+        </w:rPr>
+      </w:pPr>
+      <w:r>
+        <w:rPr>
+          <w:lang w:val="en-PK"/>
+        </w:rPr>
+        <w:t>ERROR [my-spring-app,9f8d12e1b2c8fabc,a1b2c3d4e5f67890]</w:t>
+      </w:r>
+    </w:p>
+    <w:p>
+      <w:pPr>
+        <w:rPr>
+          <w:lang w:val="en-PK"/>
+        </w:rPr>
+      </w:pPr>
+      <w:r>
+        <w:rPr>
+          <w:rFonts w:ascii="Segoe UI Symbol" w:hAnsi="Segoe UI Symbol" w:cs="Segoe UI Symbol"/>
+          <w:lang w:val="en-PK"/>
+        </w:rPr>
+        <w:t>➡</w:t>
+      </w:r>
+      <w:r>
+        <w:rPr>
+          <w:lang w:val="en-PK"/>
+        </w:rPr>
+        <w:t>️ So each log line shows:</w:t>
+      </w:r>
+    </w:p>
+    <w:p>
+      <w:pPr>
+        <w:numPr>
+          <w:ilvl w:val="0"/>
+          <w:numId w:val="11"/>
+        </w:numPr>
+        <w:rPr>
+          <w:lang w:val="en-PK"/>
+        </w:rPr>
+      </w:pPr>
+      <w:r>
+        <w:rPr>
+          <w:lang w:val="en-PK"/>
+        </w:rPr>
+        <w:t>Log level (nicely padded)</w:t>
+      </w:r>
+    </w:p>
+    <w:p>
+      <w:pPr>
+        <w:numPr>
+          <w:ilvl w:val="0"/>
+          <w:numId w:val="11"/>
+        </w:numPr>
+        <w:rPr>
+          <w:lang w:val="en-PK"/>
+        </w:rPr>
+      </w:pPr>
+      <w:r>
+        <w:rPr>
+          <w:lang w:val="en-PK"/>
+        </w:rPr>
+        <w:t>App name</w:t>
+      </w:r>
+    </w:p>
+    <w:p>
+      <w:pPr>
+        <w:numPr>
+          <w:ilvl w:val="0"/>
+          <w:numId w:val="11"/>
+        </w:numPr>
+        <w:rPr>
+          <w:lang w:val="en-PK"/>
+        </w:rPr>
+      </w:pPr>
+      <w:r>
+        <w:rPr>
+          <w:lang w:val="en-PK"/>
+        </w:rPr>
+        <w:t>Trace ID</w:t>
+      </w:r>
+    </w:p>
+    <w:p>
+      <w:pPr>
+        <w:numPr>
+          <w:ilvl w:val="0"/>
+          <w:numId w:val="11"/>
+        </w:numPr>
+        <w:rPr>
+          <w:lang w:val="en-PK"/>
+        </w:rPr>
+      </w:pPr>
+      <w:r>
+        <w:rPr>
+          <w:lang w:val="en-PK"/>
+        </w:rPr>
+        <w:t>Span ID</w:t>
+      </w:r>
+    </w:p>
+    <w:p>
+      <w:pPr>
+        <w:rPr>
+          <w:rFonts w:ascii="Segoe UI Emoji" w:hAnsi="Segoe UI Emoji" w:cs="Segoe UI Emoji"/>
+          <w:lang w:val="en-PK"/>
+        </w:rPr>
+      </w:pPr>
+      <w:r>
+        <w:rPr>
+          <w:lang w:val="en-PK"/>
+        </w:rPr>
+        <w:t xml:space="preserve">This is especially useful when you do </w:t>
+      </w:r>
+      <w:r>
+        <w:rPr>
+          <w:b/>
+          <w:bCs/>
+          <w:lang w:val="en-PK"/>
+        </w:rPr>
+        <w:t>distributed tracing</w:t>
+      </w:r>
+      <w:r>
+        <w:rPr>
+          <w:lang w:val="en-PK"/>
+        </w:rPr>
+        <w:t xml:space="preserve"> (e.g., with Sleuth or OpenTelemetry) so you can track logs by trace ID!</w:t>
+      </w:r>
+      <w:r>
+        <w:rPr>
+          <w:rFonts w:ascii="Segoe UI Emoji" w:hAnsi="Segoe UI Emoji" w:cs="Segoe UI Emoji"/>
+          <w:lang w:val="en-PK"/>
+        </w:rPr>
+        <w:t>👇</w:t>
+      </w:r>
+    </w:p>
+    <w:p>
+      <w:pPr>
+        <w:rPr>
+          <w:rFonts w:ascii="Segoe UI Emoji" w:hAnsi="Segoe UI Emoji" w:cs="Segoe UI Emoji"/>
+          <w:lang w:val="en-PK"/>
+        </w:rPr>
+      </w:pPr>
+    </w:p>
+    <w:p>
+      <w:pPr>
+        <w:rPr>
+          <w:rFonts w:cs="Times New Roman"/>
+          <w:lang w:val="en-PK"/>
+        </w:rPr>
+      </w:pPr>
+      <w:r>
+        <w:rPr>
+          <w:rFonts w:cs="Times New Roman"/>
+          <w:lang w:val="en-PK"/>
+        </w:rPr>
+        <w:t>All jars inside app/lib</w:t>
+      </w:r>
+    </w:p>
+    <w:p>
+      <w:pPr>
+        <w:rPr>
+          <w:rFonts w:cs="Times New Roman"/>
+          <w:lang w:val="en-PK"/>
+        </w:rPr>
+      </w:pPr>
+      <w:r>
+        <w:rPr>
+          <w:rFonts w:cs="Times New Roman"/>
+          <w:lang w:val="en-PK"/>
+        </w:rPr>
+        <w:t>Though jaegar and zipkins also available for tracing.</w:t>
+      </w:r>
+    </w:p>
+    <w:p>
+      <w:pPr>
+        <w:rPr>
+          <w:rFonts w:cs="Times New Roman"/>
+          <w:lang w:val="en-PK"/>
+        </w:rPr>
+      </w:pPr>
+    </w:p>
+    <w:p>
+      <w:pPr>
+        <w:rPr>
+          <w:rFonts w:cs="Times New Roman"/>
+          <w:lang w:val="en-PK"/>
+        </w:rPr>
+      </w:pPr>
+      <w:r>
+        <w:rPr>
+          <w:rFonts w:cs="Times New Roman"/>
+          <w:lang w:val="en-PK"/>
+        </w:rPr>
+        <w:t>Build the docker images and use it like localhost:3000 for Grafana dashboard.</w:t>
+      </w:r>
+    </w:p>
+    <w:p>
+      <w:pPr>
+        <w:rPr>
+          <w:lang w:val="en-PK"/>
+        </w:rPr>
+      </w:pPr>
+    </w:p>
+    <w:p>
+      <w:pPr>
+        <w:rPr>
+          <w:lang w:val="en-PK"/>
+        </w:rPr>
+      </w:pPr>
+    </w:p>
+    <w:p>
+      <w:pPr>
+        <w:rPr>
+          <w:lang w:val="en-PK"/>
+        </w:rPr>
+      </w:pPr>
     </w:p>
     <w:p>
       <w:pPr>
@@ -675,6 +2715,715 @@
 <file path=word/numbering.xml><?xml version="1.0" encoding="utf-8"?>
 <w:numbering xmlns:wpc="http://schemas.microsoft.com/office/word/2010/wordprocessingCanvas" xmlns:cx="http://schemas.microsoft.com/office/drawing/2014/chartex" xmlns:cx1="http://schemas.microsoft.com/office/drawing/2015/9/8/chartex" xmlns:cx2="http://schemas.microsoft.com/office/drawing/2015/10/21/chartex" xmlns:cx3="http://schemas.microsoft.com/office/drawing/2016/5/9/chartex" xmlns:cx4="http://schemas.microsoft.com/office/drawing/2016/5/10/chartex" xmlns:cx5="http://schemas.microsoft.com/office/drawing/2016/5/11/chartex" xmlns:cx6="http://schemas.microsoft.com/office/drawing/2016/5/12/chartex" xmlns:cx7="http://schemas.microsoft.com/office/drawing/2016/5/13/chartex" xmlns:cx8="http://schemas.microsoft.com/office/drawing/2016/5/14/chartex" xmlns:mc="http://schemas.openxmlformats.org/markup-compatibility/2006" xmlns:aink="http://schemas.microsoft.com/office/drawing/2016/ink" xmlns:am3d="http://schemas.microsoft.com/office/drawing/2017/model3d" xmlns:o="urn:schemas-microsoft-com:office:office" xmlns:oel="http://schemas.microsoft.com/office/2019/extlst" xmlns:r="http://schemas.openxmlformats.org/officeDocument/2006/relationships" xmlns:m="http://schemas.openxmlformats.org/officeDocument/2006/math" xmlns:v="urn:schemas-microsoft-com:vml" xmlns:wp14="http://schemas.microsoft.com/office/word/2010/wordprocessingDrawing" xmlns:wp="http://schemas.openxmlformats.org/drawingml/2006/wordprocessingDrawing" xmlns:w10="urn:schemas-microsoft-com:office:word" xmlns:w="http://schemas.openxmlformats.org/wordprocessingml/2006/main" xmlns:w14="http://schemas.microsoft.com/office/word/2010/wordml" xmlns:w15="http://schemas.microsoft.com/office/word/2012/wordml" xmlns:w16cex="http://schemas.microsoft.com/office/word/2018/wordml/cex" xmlns:w16cid="http://schemas.microsoft.com/office/word/2016/wordml/cid" xmlns:w16="http://schemas.microsoft.com/office/word/2018/wordml" xmlns:w16sdtdh="http://schemas.microsoft.com/office/word/2020/wordml/sdtdatahash" xmlns:w16se="http://schemas.microsoft.com/office/word/2015/wordml/symex" xmlns:wpg="http://schemas.microsoft.com/office/word/2010/wordprocessingGroup" xmlns:wpi="http://schemas.microsoft.com/office/word/2010/wordprocessingInk" xmlns:wne="http://schemas.microsoft.com/office/word/2006/wordml" xmlns:wps="http://schemas.microsoft.com/office/word/2010/wordprocessingShape" mc:Ignorable="w14 w15 w16se w16cid w16 w16cex w16sdtdh wp14">
   <w:abstractNum w:abstractNumId="0" w15:restartNumberingAfterBreak="0">
+    <w:nsid w:val="092F02C6"/>
+    <w:multiLevelType w:val="multilevel"/>
+    <w:tmpl w:val="1BBE9986"/>
+    <w:lvl w:ilvl="0">
+      <w:start w:val="1"/>
+      <w:numFmt w:val="bullet"/>
+      <w:lvlText w:val=""/>
+      <w:lvlJc w:val="left"/>
+      <w:pPr>
+        <w:tabs>
+          <w:tab w:val="num" w:pos="720"/>
+        </w:tabs>
+        <w:ind w:left="720" w:hanging="360"/>
+      </w:pPr>
+      <w:rPr>
+        <w:rFonts w:ascii="Symbol" w:hAnsi="Symbol" w:hint="default"/>
+        <w:sz w:val="20"/>
+      </w:rPr>
+    </w:lvl>
+    <w:lvl w:ilvl="1" w:tentative="1">
+      <w:start w:val="1"/>
+      <w:numFmt w:val="bullet"/>
+      <w:lvlText w:val="o"/>
+      <w:lvlJc w:val="left"/>
+      <w:pPr>
+        <w:tabs>
+          <w:tab w:val="num" w:pos="1440"/>
+        </w:tabs>
+        <w:ind w:left="1440" w:hanging="360"/>
+      </w:pPr>
+      <w:rPr>
+        <w:rFonts w:ascii="Courier New" w:hAnsi="Courier New" w:hint="default"/>
+        <w:sz w:val="20"/>
+      </w:rPr>
+    </w:lvl>
+    <w:lvl w:ilvl="2" w:tentative="1">
+      <w:start w:val="1"/>
+      <w:numFmt w:val="bullet"/>
+      <w:lvlText w:val=""/>
+      <w:lvlJc w:val="left"/>
+      <w:pPr>
+        <w:tabs>
+          <w:tab w:val="num" w:pos="2160"/>
+        </w:tabs>
+        <w:ind w:left="2160" w:hanging="360"/>
+      </w:pPr>
+      <w:rPr>
+        <w:rFonts w:ascii="Wingdings" w:hAnsi="Wingdings" w:hint="default"/>
+        <w:sz w:val="20"/>
+      </w:rPr>
+    </w:lvl>
+    <w:lvl w:ilvl="3" w:tentative="1">
+      <w:start w:val="1"/>
+      <w:numFmt w:val="bullet"/>
+      <w:lvlText w:val=""/>
+      <w:lvlJc w:val="left"/>
+      <w:pPr>
+        <w:tabs>
+          <w:tab w:val="num" w:pos="2880"/>
+        </w:tabs>
+        <w:ind w:left="2880" w:hanging="360"/>
+      </w:pPr>
+      <w:rPr>
+        <w:rFonts w:ascii="Wingdings" w:hAnsi="Wingdings" w:hint="default"/>
+        <w:sz w:val="20"/>
+      </w:rPr>
+    </w:lvl>
+    <w:lvl w:ilvl="4" w:tentative="1">
+      <w:start w:val="1"/>
+      <w:numFmt w:val="bullet"/>
+      <w:lvlText w:val=""/>
+      <w:lvlJc w:val="left"/>
+      <w:pPr>
+        <w:tabs>
+          <w:tab w:val="num" w:pos="3600"/>
+        </w:tabs>
+        <w:ind w:left="3600" w:hanging="360"/>
+      </w:pPr>
+      <w:rPr>
+        <w:rFonts w:ascii="Wingdings" w:hAnsi="Wingdings" w:hint="default"/>
+        <w:sz w:val="20"/>
+      </w:rPr>
+    </w:lvl>
+    <w:lvl w:ilvl="5" w:tentative="1">
+      <w:start w:val="1"/>
+      <w:numFmt w:val="bullet"/>
+      <w:lvlText w:val=""/>
+      <w:lvlJc w:val="left"/>
+      <w:pPr>
+        <w:tabs>
+          <w:tab w:val="num" w:pos="4320"/>
+        </w:tabs>
+        <w:ind w:left="4320" w:hanging="360"/>
+      </w:pPr>
+      <w:rPr>
+        <w:rFonts w:ascii="Wingdings" w:hAnsi="Wingdings" w:hint="default"/>
+        <w:sz w:val="20"/>
+      </w:rPr>
+    </w:lvl>
+    <w:lvl w:ilvl="6" w:tentative="1">
+      <w:start w:val="1"/>
+      <w:numFmt w:val="bullet"/>
+      <w:lvlText w:val=""/>
+      <w:lvlJc w:val="left"/>
+      <w:pPr>
+        <w:tabs>
+          <w:tab w:val="num" w:pos="5040"/>
+        </w:tabs>
+        <w:ind w:left="5040" w:hanging="360"/>
+      </w:pPr>
+      <w:rPr>
+        <w:rFonts w:ascii="Wingdings" w:hAnsi="Wingdings" w:hint="default"/>
+        <w:sz w:val="20"/>
+      </w:rPr>
+    </w:lvl>
+    <w:lvl w:ilvl="7" w:tentative="1">
+      <w:start w:val="1"/>
+      <w:numFmt w:val="bullet"/>
+      <w:lvlText w:val=""/>
+      <w:lvlJc w:val="left"/>
+      <w:pPr>
+        <w:tabs>
+          <w:tab w:val="num" w:pos="5760"/>
+        </w:tabs>
+        <w:ind w:left="5760" w:hanging="360"/>
+      </w:pPr>
+      <w:rPr>
+        <w:rFonts w:ascii="Wingdings" w:hAnsi="Wingdings" w:hint="default"/>
+        <w:sz w:val="20"/>
+      </w:rPr>
+    </w:lvl>
+    <w:lvl w:ilvl="8" w:tentative="1">
+      <w:start w:val="1"/>
+      <w:numFmt w:val="bullet"/>
+      <w:lvlText w:val=""/>
+      <w:lvlJc w:val="left"/>
+      <w:pPr>
+        <w:tabs>
+          <w:tab w:val="num" w:pos="6480"/>
+        </w:tabs>
+        <w:ind w:left="6480" w:hanging="360"/>
+      </w:pPr>
+      <w:rPr>
+        <w:rFonts w:ascii="Wingdings" w:hAnsi="Wingdings" w:hint="default"/>
+        <w:sz w:val="20"/>
+      </w:rPr>
+    </w:lvl>
+  </w:abstractNum>
+  <w:abstractNum w:abstractNumId="1" w15:restartNumberingAfterBreak="0">
+    <w:nsid w:val="0D911F8B"/>
+    <w:multiLevelType w:val="hybridMultilevel"/>
+    <w:tmpl w:val="7E82E14A"/>
+    <w:lvl w:ilvl="0" w:tplc="20000001">
+      <w:start w:val="1"/>
+      <w:numFmt w:val="bullet"/>
+      <w:lvlText w:val=""/>
+      <w:lvlJc w:val="left"/>
+      <w:pPr>
+        <w:ind w:left="720" w:hanging="360"/>
+      </w:pPr>
+      <w:rPr>
+        <w:rFonts w:ascii="Symbol" w:hAnsi="Symbol" w:hint="default"/>
+      </w:rPr>
+    </w:lvl>
+    <w:lvl w:ilvl="1" w:tplc="20000003" w:tentative="1">
+      <w:start w:val="1"/>
+      <w:numFmt w:val="bullet"/>
+      <w:lvlText w:val="o"/>
+      <w:lvlJc w:val="left"/>
+      <w:pPr>
+        <w:ind w:left="1440" w:hanging="360"/>
+      </w:pPr>
+      <w:rPr>
+        <w:rFonts w:ascii="Courier New" w:hAnsi="Courier New" w:cs="Courier New" w:hint="default"/>
+      </w:rPr>
+    </w:lvl>
+    <w:lvl w:ilvl="2" w:tplc="20000005" w:tentative="1">
+      <w:start w:val="1"/>
+      <w:numFmt w:val="bullet"/>
+      <w:lvlText w:val=""/>
+      <w:lvlJc w:val="left"/>
+      <w:pPr>
+        <w:ind w:left="2160" w:hanging="360"/>
+      </w:pPr>
+      <w:rPr>
+        <w:rFonts w:ascii="Wingdings" w:hAnsi="Wingdings" w:hint="default"/>
+      </w:rPr>
+    </w:lvl>
+    <w:lvl w:ilvl="3" w:tplc="20000001" w:tentative="1">
+      <w:start w:val="1"/>
+      <w:numFmt w:val="bullet"/>
+      <w:lvlText w:val=""/>
+      <w:lvlJc w:val="left"/>
+      <w:pPr>
+        <w:ind w:left="2880" w:hanging="360"/>
+      </w:pPr>
+      <w:rPr>
+        <w:rFonts w:ascii="Symbol" w:hAnsi="Symbol" w:hint="default"/>
+      </w:rPr>
+    </w:lvl>
+    <w:lvl w:ilvl="4" w:tplc="20000003" w:tentative="1">
+      <w:start w:val="1"/>
+      <w:numFmt w:val="bullet"/>
+      <w:lvlText w:val="o"/>
+      <w:lvlJc w:val="left"/>
+      <w:pPr>
+        <w:ind w:left="3600" w:hanging="360"/>
+      </w:pPr>
+      <w:rPr>
+        <w:rFonts w:ascii="Courier New" w:hAnsi="Courier New" w:cs="Courier New" w:hint="default"/>
+      </w:rPr>
+    </w:lvl>
+    <w:lvl w:ilvl="5" w:tplc="20000005" w:tentative="1">
+      <w:start w:val="1"/>
+      <w:numFmt w:val="bullet"/>
+      <w:lvlText w:val=""/>
+      <w:lvlJc w:val="left"/>
+      <w:pPr>
+        <w:ind w:left="4320" w:hanging="360"/>
+      </w:pPr>
+      <w:rPr>
+        <w:rFonts w:ascii="Wingdings" w:hAnsi="Wingdings" w:hint="default"/>
+      </w:rPr>
+    </w:lvl>
+    <w:lvl w:ilvl="6" w:tplc="20000001" w:tentative="1">
+      <w:start w:val="1"/>
+      <w:numFmt w:val="bullet"/>
+      <w:lvlText w:val=""/>
+      <w:lvlJc w:val="left"/>
+      <w:pPr>
+        <w:ind w:left="5040" w:hanging="360"/>
+      </w:pPr>
+      <w:rPr>
+        <w:rFonts w:ascii="Symbol" w:hAnsi="Symbol" w:hint="default"/>
+      </w:rPr>
+    </w:lvl>
+    <w:lvl w:ilvl="7" w:tplc="20000003" w:tentative="1">
+      <w:start w:val="1"/>
+      <w:numFmt w:val="bullet"/>
+      <w:lvlText w:val="o"/>
+      <w:lvlJc w:val="left"/>
+      <w:pPr>
+        <w:ind w:left="5760" w:hanging="360"/>
+      </w:pPr>
+      <w:rPr>
+        <w:rFonts w:ascii="Courier New" w:hAnsi="Courier New" w:cs="Courier New" w:hint="default"/>
+      </w:rPr>
+    </w:lvl>
+    <w:lvl w:ilvl="8" w:tplc="20000005" w:tentative="1">
+      <w:start w:val="1"/>
+      <w:numFmt w:val="bullet"/>
+      <w:lvlText w:val=""/>
+      <w:lvlJc w:val="left"/>
+      <w:pPr>
+        <w:ind w:left="6480" w:hanging="360"/>
+      </w:pPr>
+      <w:rPr>
+        <w:rFonts w:ascii="Wingdings" w:hAnsi="Wingdings" w:hint="default"/>
+      </w:rPr>
+    </w:lvl>
+  </w:abstractNum>
+  <w:abstractNum w:abstractNumId="2" w15:restartNumberingAfterBreak="0">
+    <w:nsid w:val="2D776B21"/>
+    <w:multiLevelType w:val="multilevel"/>
+    <w:tmpl w:val="323687E4"/>
+    <w:lvl w:ilvl="0">
+      <w:start w:val="1"/>
+      <w:numFmt w:val="bullet"/>
+      <w:lvlText w:val=""/>
+      <w:lvlJc w:val="left"/>
+      <w:pPr>
+        <w:tabs>
+          <w:tab w:val="num" w:pos="720"/>
+        </w:tabs>
+        <w:ind w:left="720" w:hanging="360"/>
+      </w:pPr>
+      <w:rPr>
+        <w:rFonts w:ascii="Symbol" w:hAnsi="Symbol" w:hint="default"/>
+        <w:sz w:val="20"/>
+      </w:rPr>
+    </w:lvl>
+    <w:lvl w:ilvl="1" w:tentative="1">
+      <w:start w:val="1"/>
+      <w:numFmt w:val="bullet"/>
+      <w:lvlText w:val="o"/>
+      <w:lvlJc w:val="left"/>
+      <w:pPr>
+        <w:tabs>
+          <w:tab w:val="num" w:pos="1440"/>
+        </w:tabs>
+        <w:ind w:left="1440" w:hanging="360"/>
+      </w:pPr>
+      <w:rPr>
+        <w:rFonts w:ascii="Courier New" w:hAnsi="Courier New" w:hint="default"/>
+        <w:sz w:val="20"/>
+      </w:rPr>
+    </w:lvl>
+    <w:lvl w:ilvl="2" w:tentative="1">
+      <w:start w:val="1"/>
+      <w:numFmt w:val="bullet"/>
+      <w:lvlText w:val=""/>
+      <w:lvlJc w:val="left"/>
+      <w:pPr>
+        <w:tabs>
+          <w:tab w:val="num" w:pos="2160"/>
+        </w:tabs>
+        <w:ind w:left="2160" w:hanging="360"/>
+      </w:pPr>
+      <w:rPr>
+        <w:rFonts w:ascii="Wingdings" w:hAnsi="Wingdings" w:hint="default"/>
+        <w:sz w:val="20"/>
+      </w:rPr>
+    </w:lvl>
+    <w:lvl w:ilvl="3" w:tentative="1">
+      <w:start w:val="1"/>
+      <w:numFmt w:val="bullet"/>
+      <w:lvlText w:val=""/>
+      <w:lvlJc w:val="left"/>
+      <w:pPr>
+        <w:tabs>
+          <w:tab w:val="num" w:pos="2880"/>
+        </w:tabs>
+        <w:ind w:left="2880" w:hanging="360"/>
+      </w:pPr>
+      <w:rPr>
+        <w:rFonts w:ascii="Wingdings" w:hAnsi="Wingdings" w:hint="default"/>
+        <w:sz w:val="20"/>
+      </w:rPr>
+    </w:lvl>
+    <w:lvl w:ilvl="4" w:tentative="1">
+      <w:start w:val="1"/>
+      <w:numFmt w:val="bullet"/>
+      <w:lvlText w:val=""/>
+      <w:lvlJc w:val="left"/>
+      <w:pPr>
+        <w:tabs>
+          <w:tab w:val="num" w:pos="3600"/>
+        </w:tabs>
+        <w:ind w:left="3600" w:hanging="360"/>
+      </w:pPr>
+      <w:rPr>
+        <w:rFonts w:ascii="Wingdings" w:hAnsi="Wingdings" w:hint="default"/>
+        <w:sz w:val="20"/>
+      </w:rPr>
+    </w:lvl>
+    <w:lvl w:ilvl="5" w:tentative="1">
+      <w:start w:val="1"/>
+      <w:numFmt w:val="bullet"/>
+      <w:lvlText w:val=""/>
+      <w:lvlJc w:val="left"/>
+      <w:pPr>
+        <w:tabs>
+          <w:tab w:val="num" w:pos="4320"/>
+        </w:tabs>
+        <w:ind w:left="4320" w:hanging="360"/>
+      </w:pPr>
+      <w:rPr>
+        <w:rFonts w:ascii="Wingdings" w:hAnsi="Wingdings" w:hint="default"/>
+        <w:sz w:val="20"/>
+      </w:rPr>
+    </w:lvl>
+    <w:lvl w:ilvl="6" w:tentative="1">
+      <w:start w:val="1"/>
+      <w:numFmt w:val="bullet"/>
+      <w:lvlText w:val=""/>
+      <w:lvlJc w:val="left"/>
+      <w:pPr>
+        <w:tabs>
+          <w:tab w:val="num" w:pos="5040"/>
+        </w:tabs>
+        <w:ind w:left="5040" w:hanging="360"/>
+      </w:pPr>
+      <w:rPr>
+        <w:rFonts w:ascii="Wingdings" w:hAnsi="Wingdings" w:hint="default"/>
+        <w:sz w:val="20"/>
+      </w:rPr>
+    </w:lvl>
+    <w:lvl w:ilvl="7" w:tentative="1">
+      <w:start w:val="1"/>
+      <w:numFmt w:val="bullet"/>
+      <w:lvlText w:val=""/>
+      <w:lvlJc w:val="left"/>
+      <w:pPr>
+        <w:tabs>
+          <w:tab w:val="num" w:pos="5760"/>
+        </w:tabs>
+        <w:ind w:left="5760" w:hanging="360"/>
+      </w:pPr>
+      <w:rPr>
+        <w:rFonts w:ascii="Wingdings" w:hAnsi="Wingdings" w:hint="default"/>
+        <w:sz w:val="20"/>
+      </w:rPr>
+    </w:lvl>
+    <w:lvl w:ilvl="8" w:tentative="1">
+      <w:start w:val="1"/>
+      <w:numFmt w:val="bullet"/>
+      <w:lvlText w:val=""/>
+      <w:lvlJc w:val="left"/>
+      <w:pPr>
+        <w:tabs>
+          <w:tab w:val="num" w:pos="6480"/>
+        </w:tabs>
+        <w:ind w:left="6480" w:hanging="360"/>
+      </w:pPr>
+      <w:rPr>
+        <w:rFonts w:ascii="Wingdings" w:hAnsi="Wingdings" w:hint="default"/>
+        <w:sz w:val="20"/>
+      </w:rPr>
+    </w:lvl>
+  </w:abstractNum>
+  <w:abstractNum w:abstractNumId="3" w15:restartNumberingAfterBreak="0">
+    <w:nsid w:val="34A31F51"/>
+    <w:multiLevelType w:val="multilevel"/>
+    <w:tmpl w:val="37284EC2"/>
+    <w:lvl w:ilvl="0">
+      <w:start w:val="1"/>
+      <w:numFmt w:val="bullet"/>
+      <w:lvlText w:val=""/>
+      <w:lvlJc w:val="left"/>
+      <w:pPr>
+        <w:tabs>
+          <w:tab w:val="num" w:pos="720"/>
+        </w:tabs>
+        <w:ind w:left="720" w:hanging="360"/>
+      </w:pPr>
+      <w:rPr>
+        <w:rFonts w:ascii="Symbol" w:hAnsi="Symbol" w:hint="default"/>
+        <w:sz w:val="20"/>
+      </w:rPr>
+    </w:lvl>
+    <w:lvl w:ilvl="1" w:tentative="1">
+      <w:start w:val="1"/>
+      <w:numFmt w:val="bullet"/>
+      <w:lvlText w:val="o"/>
+      <w:lvlJc w:val="left"/>
+      <w:pPr>
+        <w:tabs>
+          <w:tab w:val="num" w:pos="1440"/>
+        </w:tabs>
+        <w:ind w:left="1440" w:hanging="360"/>
+      </w:pPr>
+      <w:rPr>
+        <w:rFonts w:ascii="Courier New" w:hAnsi="Courier New" w:hint="default"/>
+        <w:sz w:val="20"/>
+      </w:rPr>
+    </w:lvl>
+    <w:lvl w:ilvl="2" w:tentative="1">
+      <w:start w:val="1"/>
+      <w:numFmt w:val="bullet"/>
+      <w:lvlText w:val=""/>
+      <w:lvlJc w:val="left"/>
+      <w:pPr>
+        <w:tabs>
+          <w:tab w:val="num" w:pos="2160"/>
+        </w:tabs>
+        <w:ind w:left="2160" w:hanging="360"/>
+      </w:pPr>
+      <w:rPr>
+        <w:rFonts w:ascii="Wingdings" w:hAnsi="Wingdings" w:hint="default"/>
+        <w:sz w:val="20"/>
+      </w:rPr>
+    </w:lvl>
+    <w:lvl w:ilvl="3" w:tentative="1">
+      <w:start w:val="1"/>
+      <w:numFmt w:val="bullet"/>
+      <w:lvlText w:val=""/>
+      <w:lvlJc w:val="left"/>
+      <w:pPr>
+        <w:tabs>
+          <w:tab w:val="num" w:pos="2880"/>
+        </w:tabs>
+        <w:ind w:left="2880" w:hanging="360"/>
+      </w:pPr>
+      <w:rPr>
+        <w:rFonts w:ascii="Wingdings" w:hAnsi="Wingdings" w:hint="default"/>
+        <w:sz w:val="20"/>
+      </w:rPr>
+    </w:lvl>
+    <w:lvl w:ilvl="4" w:tentative="1">
+      <w:start w:val="1"/>
+      <w:numFmt w:val="bullet"/>
+      <w:lvlText w:val=""/>
+      <w:lvlJc w:val="left"/>
+      <w:pPr>
+        <w:tabs>
+          <w:tab w:val="num" w:pos="3600"/>
+        </w:tabs>
+        <w:ind w:left="3600" w:hanging="360"/>
+      </w:pPr>
+      <w:rPr>
+        <w:rFonts w:ascii="Wingdings" w:hAnsi="Wingdings" w:hint="default"/>
+        <w:sz w:val="20"/>
+      </w:rPr>
+    </w:lvl>
+    <w:lvl w:ilvl="5" w:tentative="1">
+      <w:start w:val="1"/>
+      <w:numFmt w:val="bullet"/>
+      <w:lvlText w:val=""/>
+      <w:lvlJc w:val="left"/>
+      <w:pPr>
+        <w:tabs>
+          <w:tab w:val="num" w:pos="4320"/>
+        </w:tabs>
+        <w:ind w:left="4320" w:hanging="360"/>
+      </w:pPr>
+      <w:rPr>
+        <w:rFonts w:ascii="Wingdings" w:hAnsi="Wingdings" w:hint="default"/>
+        <w:sz w:val="20"/>
+      </w:rPr>
+    </w:lvl>
+    <w:lvl w:ilvl="6" w:tentative="1">
+      <w:start w:val="1"/>
+      <w:numFmt w:val="bullet"/>
+      <w:lvlText w:val=""/>
+      <w:lvlJc w:val="left"/>
+      <w:pPr>
+        <w:tabs>
+          <w:tab w:val="num" w:pos="5040"/>
+        </w:tabs>
+        <w:ind w:left="5040" w:hanging="360"/>
+      </w:pPr>
+      <w:rPr>
+        <w:rFonts w:ascii="Wingdings" w:hAnsi="Wingdings" w:hint="default"/>
+        <w:sz w:val="20"/>
+      </w:rPr>
+    </w:lvl>
+    <w:lvl w:ilvl="7" w:tentative="1">
+      <w:start w:val="1"/>
+      <w:numFmt w:val="bullet"/>
+      <w:lvlText w:val=""/>
+      <w:lvlJc w:val="left"/>
+      <w:pPr>
+        <w:tabs>
+          <w:tab w:val="num" w:pos="5760"/>
+        </w:tabs>
+        <w:ind w:left="5760" w:hanging="360"/>
+      </w:pPr>
+      <w:rPr>
+        <w:rFonts w:ascii="Wingdings" w:hAnsi="Wingdings" w:hint="default"/>
+        <w:sz w:val="20"/>
+      </w:rPr>
+    </w:lvl>
+    <w:lvl w:ilvl="8" w:tentative="1">
+      <w:start w:val="1"/>
+      <w:numFmt w:val="bullet"/>
+      <w:lvlText w:val=""/>
+      <w:lvlJc w:val="left"/>
+      <w:pPr>
+        <w:tabs>
+          <w:tab w:val="num" w:pos="6480"/>
+        </w:tabs>
+        <w:ind w:left="6480" w:hanging="360"/>
+      </w:pPr>
+      <w:rPr>
+        <w:rFonts w:ascii="Wingdings" w:hAnsi="Wingdings" w:hint="default"/>
+        <w:sz w:val="20"/>
+      </w:rPr>
+    </w:lvl>
+  </w:abstractNum>
+  <w:abstractNum w:abstractNumId="4" w15:restartNumberingAfterBreak="0">
+    <w:nsid w:val="425904DD"/>
+    <w:multiLevelType w:val="multilevel"/>
+    <w:tmpl w:val="844A97FC"/>
+    <w:lvl w:ilvl="0">
+      <w:start w:val="1"/>
+      <w:numFmt w:val="bullet"/>
+      <w:lvlText w:val=""/>
+      <w:lvlJc w:val="left"/>
+      <w:pPr>
+        <w:tabs>
+          <w:tab w:val="num" w:pos="720"/>
+        </w:tabs>
+        <w:ind w:left="720" w:hanging="360"/>
+      </w:pPr>
+      <w:rPr>
+        <w:rFonts w:ascii="Symbol" w:hAnsi="Symbol" w:hint="default"/>
+        <w:sz w:val="20"/>
+      </w:rPr>
+    </w:lvl>
+    <w:lvl w:ilvl="1" w:tentative="1">
+      <w:start w:val="1"/>
+      <w:numFmt w:val="bullet"/>
+      <w:lvlText w:val="o"/>
+      <w:lvlJc w:val="left"/>
+      <w:pPr>
+        <w:tabs>
+          <w:tab w:val="num" w:pos="1440"/>
+        </w:tabs>
+        <w:ind w:left="1440" w:hanging="360"/>
+      </w:pPr>
+      <w:rPr>
+        <w:rFonts w:ascii="Courier New" w:hAnsi="Courier New" w:hint="default"/>
+        <w:sz w:val="20"/>
+      </w:rPr>
+    </w:lvl>
+    <w:lvl w:ilvl="2" w:tentative="1">
+      <w:start w:val="1"/>
+      <w:numFmt w:val="bullet"/>
+      <w:lvlText w:val=""/>
+      <w:lvlJc w:val="left"/>
+      <w:pPr>
+        <w:tabs>
+          <w:tab w:val="num" w:pos="2160"/>
+        </w:tabs>
+        <w:ind w:left="2160" w:hanging="360"/>
+      </w:pPr>
+      <w:rPr>
+        <w:rFonts w:ascii="Wingdings" w:hAnsi="Wingdings" w:hint="default"/>
+        <w:sz w:val="20"/>
+      </w:rPr>
+    </w:lvl>
+    <w:lvl w:ilvl="3" w:tentative="1">
+      <w:start w:val="1"/>
+      <w:numFmt w:val="bullet"/>
+      <w:lvlText w:val=""/>
+      <w:lvlJc w:val="left"/>
+      <w:pPr>
+        <w:tabs>
+          <w:tab w:val="num" w:pos="2880"/>
+        </w:tabs>
+        <w:ind w:left="2880" w:hanging="360"/>
+      </w:pPr>
+      <w:rPr>
+        <w:rFonts w:ascii="Wingdings" w:hAnsi="Wingdings" w:hint="default"/>
+        <w:sz w:val="20"/>
+      </w:rPr>
+    </w:lvl>
+    <w:lvl w:ilvl="4" w:tentative="1">
+      <w:start w:val="1"/>
+      <w:numFmt w:val="bullet"/>
+      <w:lvlText w:val=""/>
+      <w:lvlJc w:val="left"/>
+      <w:pPr>
+        <w:tabs>
+          <w:tab w:val="num" w:pos="3600"/>
+        </w:tabs>
+        <w:ind w:left="3600" w:hanging="360"/>
+      </w:pPr>
+      <w:rPr>
+        <w:rFonts w:ascii="Wingdings" w:hAnsi="Wingdings" w:hint="default"/>
+        <w:sz w:val="20"/>
+      </w:rPr>
+    </w:lvl>
+    <w:lvl w:ilvl="5" w:tentative="1">
+      <w:start w:val="1"/>
+      <w:numFmt w:val="bullet"/>
+      <w:lvlText w:val=""/>
+      <w:lvlJc w:val="left"/>
+      <w:pPr>
+        <w:tabs>
+          <w:tab w:val="num" w:pos="4320"/>
+        </w:tabs>
+        <w:ind w:left="4320" w:hanging="360"/>
+      </w:pPr>
+      <w:rPr>
+        <w:rFonts w:ascii="Wingdings" w:hAnsi="Wingdings" w:hint="default"/>
+        <w:sz w:val="20"/>
+      </w:rPr>
+    </w:lvl>
+    <w:lvl w:ilvl="6" w:tentative="1">
+      <w:start w:val="1"/>
+      <w:numFmt w:val="bullet"/>
+      <w:lvlText w:val=""/>
+      <w:lvlJc w:val="left"/>
+      <w:pPr>
+        <w:tabs>
+          <w:tab w:val="num" w:pos="5040"/>
+        </w:tabs>
+        <w:ind w:left="5040" w:hanging="360"/>
+      </w:pPr>
+      <w:rPr>
+        <w:rFonts w:ascii="Wingdings" w:hAnsi="Wingdings" w:hint="default"/>
+        <w:sz w:val="20"/>
+      </w:rPr>
+    </w:lvl>
+    <w:lvl w:ilvl="7" w:tentative="1">
+      <w:start w:val="1"/>
+      <w:numFmt w:val="bullet"/>
+      <w:lvlText w:val=""/>
+      <w:lvlJc w:val="left"/>
+      <w:pPr>
+        <w:tabs>
+          <w:tab w:val="num" w:pos="5760"/>
+        </w:tabs>
+        <w:ind w:left="5760" w:hanging="360"/>
+      </w:pPr>
+      <w:rPr>
+        <w:rFonts w:ascii="Wingdings" w:hAnsi="Wingdings" w:hint="default"/>
+        <w:sz w:val="20"/>
+      </w:rPr>
+    </w:lvl>
+    <w:lvl w:ilvl="8" w:tentative="1">
+      <w:start w:val="1"/>
+      <w:numFmt w:val="bullet"/>
+      <w:lvlText w:val=""/>
+      <w:lvlJc w:val="left"/>
+      <w:pPr>
+        <w:tabs>
+          <w:tab w:val="num" w:pos="6480"/>
+        </w:tabs>
+        <w:ind w:left="6480" w:hanging="360"/>
+      </w:pPr>
+      <w:rPr>
+        <w:rFonts w:ascii="Wingdings" w:hAnsi="Wingdings" w:hint="default"/>
+        <w:sz w:val="20"/>
+      </w:rPr>
+    </w:lvl>
+  </w:abstractNum>
+  <w:abstractNum w:abstractNumId="5" w15:restartNumberingAfterBreak="0">
     <w:nsid w:val="445A65A7"/>
     <w:multiLevelType w:val="hybridMultilevel"/>
     <w:tmpl w:val="29F29E36"/>
@@ -760,7 +3509,156 @@
       </w:pPr>
     </w:lvl>
   </w:abstractNum>
-  <w:abstractNum w:abstractNumId="1" w15:restartNumberingAfterBreak="0">
+  <w:abstractNum w:abstractNumId="6" w15:restartNumberingAfterBreak="0">
+    <w:nsid w:val="577434AE"/>
+    <w:multiLevelType w:val="multilevel"/>
+    <w:tmpl w:val="7B5E2950"/>
+    <w:lvl w:ilvl="0">
+      <w:start w:val="1"/>
+      <w:numFmt w:val="bullet"/>
+      <w:lvlText w:val=""/>
+      <w:lvlJc w:val="left"/>
+      <w:pPr>
+        <w:tabs>
+          <w:tab w:val="num" w:pos="720"/>
+        </w:tabs>
+        <w:ind w:left="720" w:hanging="360"/>
+      </w:pPr>
+      <w:rPr>
+        <w:rFonts w:ascii="Symbol" w:hAnsi="Symbol" w:hint="default"/>
+        <w:sz w:val="20"/>
+      </w:rPr>
+    </w:lvl>
+    <w:lvl w:ilvl="1" w:tentative="1">
+      <w:start w:val="1"/>
+      <w:numFmt w:val="bullet"/>
+      <w:lvlText w:val="o"/>
+      <w:lvlJc w:val="left"/>
+      <w:pPr>
+        <w:tabs>
+          <w:tab w:val="num" w:pos="1440"/>
+        </w:tabs>
+        <w:ind w:left="1440" w:hanging="360"/>
+      </w:pPr>
+      <w:rPr>
+        <w:rFonts w:ascii="Courier New" w:hAnsi="Courier New" w:hint="default"/>
+        <w:sz w:val="20"/>
+      </w:rPr>
+    </w:lvl>
+    <w:lvl w:ilvl="2" w:tentative="1">
+      <w:start w:val="1"/>
+      <w:numFmt w:val="bullet"/>
+      <w:lvlText w:val=""/>
+      <w:lvlJc w:val="left"/>
+      <w:pPr>
+        <w:tabs>
+          <w:tab w:val="num" w:pos="2160"/>
+        </w:tabs>
+        <w:ind w:left="2160" w:hanging="360"/>
+      </w:pPr>
+      <w:rPr>
+        <w:rFonts w:ascii="Wingdings" w:hAnsi="Wingdings" w:hint="default"/>
+        <w:sz w:val="20"/>
+      </w:rPr>
+    </w:lvl>
+    <w:lvl w:ilvl="3" w:tentative="1">
+      <w:start w:val="1"/>
+      <w:numFmt w:val="bullet"/>
+      <w:lvlText w:val=""/>
+      <w:lvlJc w:val="left"/>
+      <w:pPr>
+        <w:tabs>
+          <w:tab w:val="num" w:pos="2880"/>
+        </w:tabs>
+        <w:ind w:left="2880" w:hanging="360"/>
+      </w:pPr>
+      <w:rPr>
+        <w:rFonts w:ascii="Wingdings" w:hAnsi="Wingdings" w:hint="default"/>
+        <w:sz w:val="20"/>
+      </w:rPr>
+    </w:lvl>
+    <w:lvl w:ilvl="4" w:tentative="1">
+      <w:start w:val="1"/>
+      <w:numFmt w:val="bullet"/>
+      <w:lvlText w:val=""/>
+      <w:lvlJc w:val="left"/>
+      <w:pPr>
+        <w:tabs>
+          <w:tab w:val="num" w:pos="3600"/>
+        </w:tabs>
+        <w:ind w:left="3600" w:hanging="360"/>
+      </w:pPr>
+      <w:rPr>
+        <w:rFonts w:ascii="Wingdings" w:hAnsi="Wingdings" w:hint="default"/>
+        <w:sz w:val="20"/>
+      </w:rPr>
+    </w:lvl>
+    <w:lvl w:ilvl="5" w:tentative="1">
+      <w:start w:val="1"/>
+      <w:numFmt w:val="bullet"/>
+      <w:lvlText w:val=""/>
+      <w:lvlJc w:val="left"/>
+      <w:pPr>
+        <w:tabs>
+          <w:tab w:val="num" w:pos="4320"/>
+        </w:tabs>
+        <w:ind w:left="4320" w:hanging="360"/>
+      </w:pPr>
+      <w:rPr>
+        <w:rFonts w:ascii="Wingdings" w:hAnsi="Wingdings" w:hint="default"/>
+        <w:sz w:val="20"/>
+      </w:rPr>
+    </w:lvl>
+    <w:lvl w:ilvl="6" w:tentative="1">
+      <w:start w:val="1"/>
+      <w:numFmt w:val="bullet"/>
+      <w:lvlText w:val=""/>
+      <w:lvlJc w:val="left"/>
+      <w:pPr>
+        <w:tabs>
+          <w:tab w:val="num" w:pos="5040"/>
+        </w:tabs>
+        <w:ind w:left="5040" w:hanging="360"/>
+      </w:pPr>
+      <w:rPr>
+        <w:rFonts w:ascii="Wingdings" w:hAnsi="Wingdings" w:hint="default"/>
+        <w:sz w:val="20"/>
+      </w:rPr>
+    </w:lvl>
+    <w:lvl w:ilvl="7" w:tentative="1">
+      <w:start w:val="1"/>
+      <w:numFmt w:val="bullet"/>
+      <w:lvlText w:val=""/>
+      <w:lvlJc w:val="left"/>
+      <w:pPr>
+        <w:tabs>
+          <w:tab w:val="num" w:pos="5760"/>
+        </w:tabs>
+        <w:ind w:left="5760" w:hanging="360"/>
+      </w:pPr>
+      <w:rPr>
+        <w:rFonts w:ascii="Wingdings" w:hAnsi="Wingdings" w:hint="default"/>
+        <w:sz w:val="20"/>
+      </w:rPr>
+    </w:lvl>
+    <w:lvl w:ilvl="8" w:tentative="1">
+      <w:start w:val="1"/>
+      <w:numFmt w:val="bullet"/>
+      <w:lvlText w:val=""/>
+      <w:lvlJc w:val="left"/>
+      <w:pPr>
+        <w:tabs>
+          <w:tab w:val="num" w:pos="6480"/>
+        </w:tabs>
+        <w:ind w:left="6480" w:hanging="360"/>
+      </w:pPr>
+      <w:rPr>
+        <w:rFonts w:ascii="Wingdings" w:hAnsi="Wingdings" w:hint="default"/>
+        <w:sz w:val="20"/>
+      </w:rPr>
+    </w:lvl>
+  </w:abstractNum>
+  <w:abstractNum w:abstractNumId="7" w15:restartNumberingAfterBreak="0">
     <w:nsid w:val="68623CB8"/>
     <w:multiLevelType w:val="multilevel"/>
     <w:tmpl w:val="22BCCAD4"/>
@@ -873,7 +3771,305 @@
       </w:pPr>
     </w:lvl>
   </w:abstractNum>
-  <w:abstractNum w:abstractNumId="2" w15:restartNumberingAfterBreak="0">
+  <w:abstractNum w:abstractNumId="8" w15:restartNumberingAfterBreak="0">
+    <w:nsid w:val="6E9E0262"/>
+    <w:multiLevelType w:val="multilevel"/>
+    <w:tmpl w:val="4D182686"/>
+    <w:lvl w:ilvl="0">
+      <w:start w:val="1"/>
+      <w:numFmt w:val="bullet"/>
+      <w:lvlText w:val=""/>
+      <w:lvlJc w:val="left"/>
+      <w:pPr>
+        <w:tabs>
+          <w:tab w:val="num" w:pos="720"/>
+        </w:tabs>
+        <w:ind w:left="720" w:hanging="360"/>
+      </w:pPr>
+      <w:rPr>
+        <w:rFonts w:ascii="Symbol" w:hAnsi="Symbol" w:hint="default"/>
+        <w:sz w:val="20"/>
+      </w:rPr>
+    </w:lvl>
+    <w:lvl w:ilvl="1" w:tentative="1">
+      <w:start w:val="1"/>
+      <w:numFmt w:val="bullet"/>
+      <w:lvlText w:val="o"/>
+      <w:lvlJc w:val="left"/>
+      <w:pPr>
+        <w:tabs>
+          <w:tab w:val="num" w:pos="1440"/>
+        </w:tabs>
+        <w:ind w:left="1440" w:hanging="360"/>
+      </w:pPr>
+      <w:rPr>
+        <w:rFonts w:ascii="Courier New" w:hAnsi="Courier New" w:hint="default"/>
+        <w:sz w:val="20"/>
+      </w:rPr>
+    </w:lvl>
+    <w:lvl w:ilvl="2" w:tentative="1">
+      <w:start w:val="1"/>
+      <w:numFmt w:val="bullet"/>
+      <w:lvlText w:val=""/>
+      <w:lvlJc w:val="left"/>
+      <w:pPr>
+        <w:tabs>
+          <w:tab w:val="num" w:pos="2160"/>
+        </w:tabs>
+        <w:ind w:left="2160" w:hanging="360"/>
+      </w:pPr>
+      <w:rPr>
+        <w:rFonts w:ascii="Wingdings" w:hAnsi="Wingdings" w:hint="default"/>
+        <w:sz w:val="20"/>
+      </w:rPr>
+    </w:lvl>
+    <w:lvl w:ilvl="3" w:tentative="1">
+      <w:start w:val="1"/>
+      <w:numFmt w:val="bullet"/>
+      <w:lvlText w:val=""/>
+      <w:lvlJc w:val="left"/>
+      <w:pPr>
+        <w:tabs>
+          <w:tab w:val="num" w:pos="2880"/>
+        </w:tabs>
+        <w:ind w:left="2880" w:hanging="360"/>
+      </w:pPr>
+      <w:rPr>
+        <w:rFonts w:ascii="Wingdings" w:hAnsi="Wingdings" w:hint="default"/>
+        <w:sz w:val="20"/>
+      </w:rPr>
+    </w:lvl>
+    <w:lvl w:ilvl="4" w:tentative="1">
+      <w:start w:val="1"/>
+      <w:numFmt w:val="bullet"/>
+      <w:lvlText w:val=""/>
+      <w:lvlJc w:val="left"/>
+      <w:pPr>
+        <w:tabs>
+          <w:tab w:val="num" w:pos="3600"/>
+        </w:tabs>
+        <w:ind w:left="3600" w:hanging="360"/>
+      </w:pPr>
+      <w:rPr>
+        <w:rFonts w:ascii="Wingdings" w:hAnsi="Wingdings" w:hint="default"/>
+        <w:sz w:val="20"/>
+      </w:rPr>
+    </w:lvl>
+    <w:lvl w:ilvl="5" w:tentative="1">
+      <w:start w:val="1"/>
+      <w:numFmt w:val="bullet"/>
+      <w:lvlText w:val=""/>
+      <w:lvlJc w:val="left"/>
+      <w:pPr>
+        <w:tabs>
+          <w:tab w:val="num" w:pos="4320"/>
+        </w:tabs>
+        <w:ind w:left="4320" w:hanging="360"/>
+      </w:pPr>
+      <w:rPr>
+        <w:rFonts w:ascii="Wingdings" w:hAnsi="Wingdings" w:hint="default"/>
+        <w:sz w:val="20"/>
+      </w:rPr>
+    </w:lvl>
+    <w:lvl w:ilvl="6" w:tentative="1">
+      <w:start w:val="1"/>
+      <w:numFmt w:val="bullet"/>
+      <w:lvlText w:val=""/>
+      <w:lvlJc w:val="left"/>
+      <w:pPr>
+        <w:tabs>
+          <w:tab w:val="num" w:pos="5040"/>
+        </w:tabs>
+        <w:ind w:left="5040" w:hanging="360"/>
+      </w:pPr>
+      <w:rPr>
+        <w:rFonts w:ascii="Wingdings" w:hAnsi="Wingdings" w:hint="default"/>
+        <w:sz w:val="20"/>
+      </w:rPr>
+    </w:lvl>
+    <w:lvl w:ilvl="7" w:tentative="1">
+      <w:start w:val="1"/>
+      <w:numFmt w:val="bullet"/>
+      <w:lvlText w:val=""/>
+      <w:lvlJc w:val="left"/>
+      <w:pPr>
+        <w:tabs>
+          <w:tab w:val="num" w:pos="5760"/>
+        </w:tabs>
+        <w:ind w:left="5760" w:hanging="360"/>
+      </w:pPr>
+      <w:rPr>
+        <w:rFonts w:ascii="Wingdings" w:hAnsi="Wingdings" w:hint="default"/>
+        <w:sz w:val="20"/>
+      </w:rPr>
+    </w:lvl>
+    <w:lvl w:ilvl="8" w:tentative="1">
+      <w:start w:val="1"/>
+      <w:numFmt w:val="bullet"/>
+      <w:lvlText w:val=""/>
+      <w:lvlJc w:val="left"/>
+      <w:pPr>
+        <w:tabs>
+          <w:tab w:val="num" w:pos="6480"/>
+        </w:tabs>
+        <w:ind w:left="6480" w:hanging="360"/>
+      </w:pPr>
+      <w:rPr>
+        <w:rFonts w:ascii="Wingdings" w:hAnsi="Wingdings" w:hint="default"/>
+        <w:sz w:val="20"/>
+      </w:rPr>
+    </w:lvl>
+  </w:abstractNum>
+  <w:abstractNum w:abstractNumId="9" w15:restartNumberingAfterBreak="0">
+    <w:nsid w:val="6F0144EE"/>
+    <w:multiLevelType w:val="multilevel"/>
+    <w:tmpl w:val="627491B8"/>
+    <w:lvl w:ilvl="0">
+      <w:start w:val="1"/>
+      <w:numFmt w:val="bullet"/>
+      <w:lvlText w:val=""/>
+      <w:lvlJc w:val="left"/>
+      <w:pPr>
+        <w:tabs>
+          <w:tab w:val="num" w:pos="720"/>
+        </w:tabs>
+        <w:ind w:left="720" w:hanging="360"/>
+      </w:pPr>
+      <w:rPr>
+        <w:rFonts w:ascii="Symbol" w:hAnsi="Symbol" w:hint="default"/>
+        <w:sz w:val="20"/>
+      </w:rPr>
+    </w:lvl>
+    <w:lvl w:ilvl="1" w:tentative="1">
+      <w:start w:val="1"/>
+      <w:numFmt w:val="bullet"/>
+      <w:lvlText w:val="o"/>
+      <w:lvlJc w:val="left"/>
+      <w:pPr>
+        <w:tabs>
+          <w:tab w:val="num" w:pos="1440"/>
+        </w:tabs>
+        <w:ind w:left="1440" w:hanging="360"/>
+      </w:pPr>
+      <w:rPr>
+        <w:rFonts w:ascii="Courier New" w:hAnsi="Courier New" w:hint="default"/>
+        <w:sz w:val="20"/>
+      </w:rPr>
+    </w:lvl>
+    <w:lvl w:ilvl="2" w:tentative="1">
+      <w:start w:val="1"/>
+      <w:numFmt w:val="bullet"/>
+      <w:lvlText w:val=""/>
+      <w:lvlJc w:val="left"/>
+      <w:pPr>
+        <w:tabs>
+          <w:tab w:val="num" w:pos="2160"/>
+        </w:tabs>
+        <w:ind w:left="2160" w:hanging="360"/>
+      </w:pPr>
+      <w:rPr>
+        <w:rFonts w:ascii="Wingdings" w:hAnsi="Wingdings" w:hint="default"/>
+        <w:sz w:val="20"/>
+      </w:rPr>
+    </w:lvl>
+    <w:lvl w:ilvl="3" w:tentative="1">
+      <w:start w:val="1"/>
+      <w:numFmt w:val="bullet"/>
+      <w:lvlText w:val=""/>
+      <w:lvlJc w:val="left"/>
+      <w:pPr>
+        <w:tabs>
+          <w:tab w:val="num" w:pos="2880"/>
+        </w:tabs>
+        <w:ind w:left="2880" w:hanging="360"/>
+      </w:pPr>
+      <w:rPr>
+        <w:rFonts w:ascii="Wingdings" w:hAnsi="Wingdings" w:hint="default"/>
+        <w:sz w:val="20"/>
+      </w:rPr>
+    </w:lvl>
+    <w:lvl w:ilvl="4" w:tentative="1">
+      <w:start w:val="1"/>
+      <w:numFmt w:val="bullet"/>
+      <w:lvlText w:val=""/>
+      <w:lvlJc w:val="left"/>
+      <w:pPr>
+        <w:tabs>
+          <w:tab w:val="num" w:pos="3600"/>
+        </w:tabs>
+        <w:ind w:left="3600" w:hanging="360"/>
+      </w:pPr>
+      <w:rPr>
+        <w:rFonts w:ascii="Wingdings" w:hAnsi="Wingdings" w:hint="default"/>
+        <w:sz w:val="20"/>
+      </w:rPr>
+    </w:lvl>
+    <w:lvl w:ilvl="5" w:tentative="1">
+      <w:start w:val="1"/>
+      <w:numFmt w:val="bullet"/>
+      <w:lvlText w:val=""/>
+      <w:lvlJc w:val="left"/>
+      <w:pPr>
+        <w:tabs>
+          <w:tab w:val="num" w:pos="4320"/>
+        </w:tabs>
+        <w:ind w:left="4320" w:hanging="360"/>
+      </w:pPr>
+      <w:rPr>
+        <w:rFonts w:ascii="Wingdings" w:hAnsi="Wingdings" w:hint="default"/>
+        <w:sz w:val="20"/>
+      </w:rPr>
+    </w:lvl>
+    <w:lvl w:ilvl="6" w:tentative="1">
+      <w:start w:val="1"/>
+      <w:numFmt w:val="bullet"/>
+      <w:lvlText w:val=""/>
+      <w:lvlJc w:val="left"/>
+      <w:pPr>
+        <w:tabs>
+          <w:tab w:val="num" w:pos="5040"/>
+        </w:tabs>
+        <w:ind w:left="5040" w:hanging="360"/>
+      </w:pPr>
+      <w:rPr>
+        <w:rFonts w:ascii="Wingdings" w:hAnsi="Wingdings" w:hint="default"/>
+        <w:sz w:val="20"/>
+      </w:rPr>
+    </w:lvl>
+    <w:lvl w:ilvl="7" w:tentative="1">
+      <w:start w:val="1"/>
+      <w:numFmt w:val="bullet"/>
+      <w:lvlText w:val=""/>
+      <w:lvlJc w:val="left"/>
+      <w:pPr>
+        <w:tabs>
+          <w:tab w:val="num" w:pos="5760"/>
+        </w:tabs>
+        <w:ind w:left="5760" w:hanging="360"/>
+      </w:pPr>
+      <w:rPr>
+        <w:rFonts w:ascii="Wingdings" w:hAnsi="Wingdings" w:hint="default"/>
+        <w:sz w:val="20"/>
+      </w:rPr>
+    </w:lvl>
+    <w:lvl w:ilvl="8" w:tentative="1">
+      <w:start w:val="1"/>
+      <w:numFmt w:val="bullet"/>
+      <w:lvlText w:val=""/>
+      <w:lvlJc w:val="left"/>
+      <w:pPr>
+        <w:tabs>
+          <w:tab w:val="num" w:pos="6480"/>
+        </w:tabs>
+        <w:ind w:left="6480" w:hanging="360"/>
+      </w:pPr>
+      <w:rPr>
+        <w:rFonts w:ascii="Wingdings" w:hAnsi="Wingdings" w:hint="default"/>
+        <w:sz w:val="20"/>
+      </w:rPr>
+    </w:lvl>
+  </w:abstractNum>
+  <w:abstractNum w:abstractNumId="10" w15:restartNumberingAfterBreak="0">
     <w:nsid w:val="77072ABA"/>
     <w:multiLevelType w:val="multilevel"/>
     <w:tmpl w:val="A100EBCE"/>
@@ -988,15 +4184,39 @@
     </w:lvl>
   </w:abstractNum>
   <w:num w:numId="1" w16cid:durableId="1754811861">
+    <w:abstractNumId w:val="5"/>
+  </w:num>
+  <w:num w:numId="2" w16cid:durableId="290282579">
+    <w:abstractNumId w:val="5"/>
+  </w:num>
+  <w:num w:numId="3" w16cid:durableId="1935935932">
+    <w:abstractNumId w:val="10"/>
+  </w:num>
+  <w:num w:numId="4" w16cid:durableId="1928073903">
+    <w:abstractNumId w:val="7"/>
+  </w:num>
+  <w:num w:numId="5" w16cid:durableId="620040904">
+    <w:abstractNumId w:val="4"/>
+  </w:num>
+  <w:num w:numId="6" w16cid:durableId="1511140551">
+    <w:abstractNumId w:val="2"/>
+  </w:num>
+  <w:num w:numId="7" w16cid:durableId="590086216">
     <w:abstractNumId w:val="0"/>
   </w:num>
-  <w:num w:numId="2" w16cid:durableId="290282579">
-    <w:abstractNumId w:val="0"/>
+  <w:num w:numId="8" w16cid:durableId="864948718">
+    <w:abstractNumId w:val="8"/>
   </w:num>
-  <w:num w:numId="3" w16cid:durableId="1935935932">
-    <w:abstractNumId w:val="2"/>
+  <w:num w:numId="9" w16cid:durableId="1611429659">
+    <w:abstractNumId w:val="3"/>
   </w:num>
-  <w:num w:numId="4" w16cid:durableId="1928073903">
+  <w:num w:numId="10" w16cid:durableId="1693264693">
+    <w:abstractNumId w:val="9"/>
+  </w:num>
+  <w:num w:numId="11" w16cid:durableId="307437147">
+    <w:abstractNumId w:val="6"/>
+  </w:num>
+  <w:num w:numId="12" w16cid:durableId="41101561">
     <w:abstractNumId w:val="1"/>
   </w:num>
 </w:numbering>
@@ -1979,6 +5199,37 @@
       <w:shd w:val="clear" w:color="auto" w:fill="E1DFDD"/>
     </w:rPr>
   </w:style>
+  <w:style w:type="paragraph" w:styleId="HTMLPreformatted">
+    <w:name w:val="HTML Preformatted"/>
+    <w:basedOn w:val="Normal"/>
+    <w:link w:val="HTMLPreformattedChar"/>
+    <w:uiPriority w:val="99"/>
+    <w:semiHidden/>
+    <w:unhideWhenUsed/>
+    <w:rsid w:val="005C4511"/>
+    <w:pPr>
+      <w:spacing w:after="0" w:line="240" w:lineRule="auto"/>
+    </w:pPr>
+    <w:rPr>
+      <w:rFonts w:ascii="Consolas" w:hAnsi="Consolas"/>
+      <w:sz w:val="20"/>
+      <w:szCs w:val="20"/>
+    </w:rPr>
+  </w:style>
+  <w:style w:type="character" w:customStyle="1" w:styleId="HTMLPreformattedChar">
+    <w:name w:val="HTML Preformatted Char"/>
+    <w:basedOn w:val="DefaultParagraphFont"/>
+    <w:link w:val="HTMLPreformatted"/>
+    <w:uiPriority w:val="99"/>
+    <w:semiHidden/>
+    <w:rsid w:val="005C4511"/>
+    <w:rPr>
+      <w:rFonts w:ascii="Consolas" w:hAnsi="Consolas"/>
+      <w:sz w:val="20"/>
+      <w:szCs w:val="20"/>
+      <w:lang w:val="en-US"/>
+    </w:rPr>
+  </w:style>
 </w:styles>
 </file>
 

</xml_diff>